<commit_message>
docs: populate all manual book screenshot tables with actual app screenshots
</commit_message>
<xml_diff>
--- a/Manual_Book_SIGIGI_2.0.docx
+++ b/Manual_Book_SIGIGI_2.0.docx
@@ -4257,7 +4257,35 @@
         <w:rPr>
           <w:color w:val="000000" w:themeColor="text1"/>
         </w:rPr>
-        <w:t>Buka https://sigigi.my.id melalui browser.</w:t>
+        <w:t xml:space="preserve">Buka </w:t>
+      </w:r>
+      <w:hyperlink r:id="rId8" w:history="1">
+        <w:r>
+          <w:rPr>
+            <w:rStyle w:val="Hyperlink"/>
+          </w:rPr>
+          <w:t>https://sigigi.my.id/auth/login</w:t>
+        </w:r>
+      </w:hyperlink>
+      <w:r>
+        <w:rPr>
+          <w:color w:val="000000" w:themeColor="text1"/>
+        </w:rPr>
+        <w:t xml:space="preserve"> </w:t>
+      </w:r>
+      <w:proofErr w:type="spellStart"/>
+      <w:r>
+        <w:rPr>
+          <w:color w:val="000000" w:themeColor="text1"/>
+        </w:rPr>
+        <w:t>melalui</w:t>
+      </w:r>
+      <w:proofErr w:type="spellEnd"/>
+      <w:r>
+        <w:rPr>
+          <w:color w:val="000000" w:themeColor="text1"/>
+        </w:rPr>
+        <w:t xml:space="preserve"> browser.</w:t>
       </w:r>
     </w:p>
     <w:p>
@@ -4369,35 +4397,65 @@
                 <w:color w:val="000000" w:themeColor="text1"/>
               </w:rPr>
             </w:pPr>
+            <w:r/>
+            <w:r>
+              <w:drawing>
+                <wp:inline xmlns:a="http://schemas.openxmlformats.org/drawingml/2006/main" xmlns:pic="http://schemas.openxmlformats.org/drawingml/2006/picture">
+                  <wp:extent cx="5303520" cy="2737390"/>
+                  <wp:docPr id="1" name="Picture 1"/>
+                  <wp:cNvGraphicFramePr>
+                    <a:graphicFrameLocks noChangeAspect="1"/>
+                  </wp:cNvGraphicFramePr>
+                  <a:graphic>
+                    <a:graphicData uri="http://schemas.openxmlformats.org/drawingml/2006/picture">
+                      <pic:pic>
+                        <pic:nvPicPr>
+                          <pic:cNvPr id="0" name="01_login_staf_sukses_1781491070641.png"/>
+                          <pic:cNvPicPr/>
+                        </pic:nvPicPr>
+                        <pic:blipFill>
+                          <a:blip r:embed="rId13"/>
+                          <a:stretch>
+                            <a:fillRect/>
+                          </a:stretch>
+                        </pic:blipFill>
+                        <pic:spPr>
+                          <a:xfrm>
+                            <a:off x="0" y="0"/>
+                            <a:ext cx="5303520" cy="2737390"/>
+                          </a:xfrm>
+                          <a:prstGeom prst="rect"/>
+                        </pic:spPr>
+                      </pic:pic>
+                    </a:graphicData>
+                  </a:graphic>
+                </wp:inline>
+              </w:drawing>
+            </w:r>
+          </w:p>
+          <w:p>
+            <w:pPr>
+              <w:spacing w:before="120" w:after="80"/>
+              <w:jc w:val="center"/>
+            </w:pPr>
             <w:r>
               <w:rPr>
                 <w:b/>
-                <w:color w:val="000000" w:themeColor="text1"/>
-                <w:sz w:val="20"/>
-              </w:rPr>
-              <w:t>[Tempel screenshot di sini]</w:t>
-            </w:r>
-            <w:r>
-              <w:rPr>
-                <w:b/>
-                <w:color w:val="000000" w:themeColor="text1"/>
-                <w:sz w:val="20"/>
-              </w:rPr>
-              <w:br/>
+                <w:sz w:val="22"/>
+              </w:rPr>
               <w:t>Halaman Login Portal Admin/Staff</w:t>
             </w:r>
           </w:p>
           <w:p>
             <w:pPr>
+              <w:spacing w:after="120"/>
               <w:jc w:val="center"/>
-              <w:rPr>
-                <w:color w:val="000000" w:themeColor="text1"/>
-              </w:rPr>
-            </w:pPr>
-            <w:r>
-              <w:rPr>
-                <w:color w:val="000000" w:themeColor="text1"/>
-                <w:sz w:val="17"/>
+            </w:pPr>
+            <w:r>
+              <w:rPr>
+                <w:i/>
+                <w:color w:val="646464"/>
+                <w:sz w:val="19"/>
               </w:rPr>
               <w:t>Tampilkan form login dan pesan pembatasan akses role bila perlu.</w:t>
             </w:r>
@@ -4562,22 +4620,52 @@
                 <w:color w:val="000000" w:themeColor="text1"/>
               </w:rPr>
             </w:pPr>
+            <w:r/>
+            <w:r>
+              <w:drawing>
+                <wp:inline xmlns:a="http://schemas.openxmlformats.org/drawingml/2006/main" xmlns:pic="http://schemas.openxmlformats.org/drawingml/2006/picture">
+                  <wp:extent cx="5303520" cy="2737390"/>
+                  <wp:docPr id="2" name="Picture 2"/>
+                  <wp:cNvGraphicFramePr>
+                    <a:graphicFrameLocks noChangeAspect="1"/>
+                  </wp:cNvGraphicFramePr>
+                  <a:graphic>
+                    <a:graphicData uri="http://schemas.openxmlformats.org/drawingml/2006/picture">
+                      <pic:pic>
+                        <pic:nvPicPr>
+                          <pic:cNvPr id="0" name="53_dashboard_summary_cards_1781491979654.png"/>
+                          <pic:cNvPicPr/>
+                        </pic:nvPicPr>
+                        <pic:blipFill>
+                          <a:blip r:embed="rId14"/>
+                          <a:stretch>
+                            <a:fillRect/>
+                          </a:stretch>
+                        </pic:blipFill>
+                        <pic:spPr>
+                          <a:xfrm>
+                            <a:off x="0" y="0"/>
+                            <a:ext cx="5303520" cy="2737390"/>
+                          </a:xfrm>
+                          <a:prstGeom prst="rect"/>
+                        </pic:spPr>
+                      </pic:pic>
+                    </a:graphicData>
+                  </a:graphic>
+                </wp:inline>
+              </w:drawing>
+            </w:r>
+          </w:p>
+          <w:p>
+            <w:pPr>
+              <w:spacing w:before="120" w:after="80"/>
+              <w:jc w:val="center"/>
+            </w:pPr>
             <w:r>
               <w:rPr>
                 <w:b/>
-                <w:color w:val="000000" w:themeColor="text1"/>
-                <w:sz w:val="20"/>
-              </w:rPr>
-              <w:lastRenderedPageBreak/>
-              <w:t>[Tempel screenshot di sini]</w:t>
-            </w:r>
-            <w:r>
-              <w:rPr>
-                <w:b/>
-                <w:color w:val="000000" w:themeColor="text1"/>
-                <w:sz w:val="20"/>
-              </w:rPr>
-              <w:br/>
+                <w:sz w:val="22"/>
+              </w:rPr>
               <w:t>Dashboard Admin/Staff</w:t>
             </w:r>
           </w:p>
@@ -4783,21 +4871,52 @@
                 <w:color w:val="000000" w:themeColor="text1"/>
               </w:rPr>
             </w:pPr>
+            <w:r/>
+            <w:r>
+              <w:drawing>
+                <wp:inline xmlns:a="http://schemas.openxmlformats.org/drawingml/2006/main" xmlns:pic="http://schemas.openxmlformats.org/drawingml/2006/picture">
+                  <wp:extent cx="5303520" cy="2679382"/>
+                  <wp:docPr id="3" name="Picture 3"/>
+                  <wp:cNvGraphicFramePr>
+                    <a:graphicFrameLocks noChangeAspect="1"/>
+                  </wp:cNvGraphicFramePr>
+                  <a:graphic>
+                    <a:graphicData uri="http://schemas.openxmlformats.org/drawingml/2006/picture">
+                      <pic:pic>
+                        <pic:nvPicPr>
+                          <pic:cNvPr id="0" name="57_manajemen_pengguna_png_1781607503703.png"/>
+                          <pic:cNvPicPr/>
+                        </pic:nvPicPr>
+                        <pic:blipFill>
+                          <a:blip r:embed="rId15"/>
+                          <a:stretch>
+                            <a:fillRect/>
+                          </a:stretch>
+                        </pic:blipFill>
+                        <pic:spPr>
+                          <a:xfrm>
+                            <a:off x="0" y="0"/>
+                            <a:ext cx="5303520" cy="2679382"/>
+                          </a:xfrm>
+                          <a:prstGeom prst="rect"/>
+                        </pic:spPr>
+                      </pic:pic>
+                    </a:graphicData>
+                  </a:graphic>
+                </wp:inline>
+              </w:drawing>
+            </w:r>
+          </w:p>
+          <w:p>
+            <w:pPr>
+              <w:spacing w:before="120" w:after="80"/>
+              <w:jc w:val="center"/>
+            </w:pPr>
             <w:r>
               <w:rPr>
                 <w:b/>
-                <w:color w:val="000000" w:themeColor="text1"/>
-                <w:sz w:val="20"/>
-              </w:rPr>
-              <w:t>[Tempel screenshot di sini]</w:t>
-            </w:r>
-            <w:r>
-              <w:rPr>
-                <w:b/>
-                <w:color w:val="000000" w:themeColor="text1"/>
-                <w:sz w:val="20"/>
-              </w:rPr>
-              <w:br/>
+                <w:sz w:val="22"/>
+              </w:rPr>
               <w:t>Halaman Manajemen Pengguna</w:t>
             </w:r>
           </w:p>
@@ -4989,22 +5108,52 @@
                 <w:color w:val="000000" w:themeColor="text1"/>
               </w:rPr>
             </w:pPr>
+            <w:r/>
+            <w:r>
+              <w:drawing>
+                <wp:inline xmlns:a="http://schemas.openxmlformats.org/drawingml/2006/main" xmlns:pic="http://schemas.openxmlformats.org/drawingml/2006/picture">
+                  <wp:extent cx="5303520" cy="2737390"/>
+                  <wp:docPr id="4" name="Picture 4"/>
+                  <wp:cNvGraphicFramePr>
+                    <a:graphicFrameLocks noChangeAspect="1"/>
+                  </wp:cNvGraphicFramePr>
+                  <a:graphic>
+                    <a:graphicData uri="http://schemas.openxmlformats.org/drawingml/2006/picture">
+                      <pic:pic>
+                        <pic:nvPicPr>
+                          <pic:cNvPr id="0" name="12_tambah_klinik_sukses_1781492068537.png"/>
+                          <pic:cNvPicPr/>
+                        </pic:nvPicPr>
+                        <pic:blipFill>
+                          <a:blip r:embed="rId16"/>
+                          <a:stretch>
+                            <a:fillRect/>
+                          </a:stretch>
+                        </pic:blipFill>
+                        <pic:spPr>
+                          <a:xfrm>
+                            <a:off x="0" y="0"/>
+                            <a:ext cx="5303520" cy="2737390"/>
+                          </a:xfrm>
+                          <a:prstGeom prst="rect"/>
+                        </pic:spPr>
+                      </pic:pic>
+                    </a:graphicData>
+                  </a:graphic>
+                </wp:inline>
+              </w:drawing>
+            </w:r>
+          </w:p>
+          <w:p>
+            <w:pPr>
+              <w:spacing w:before="120" w:after="80"/>
+              <w:jc w:val="center"/>
+            </w:pPr>
             <w:r>
               <w:rPr>
                 <w:b/>
-                <w:color w:val="000000" w:themeColor="text1"/>
-                <w:sz w:val="20"/>
-              </w:rPr>
-              <w:lastRenderedPageBreak/>
-              <w:t>[Tempel screenshot di sini]</w:t>
-            </w:r>
-            <w:r>
-              <w:rPr>
-                <w:b/>
-                <w:color w:val="000000" w:themeColor="text1"/>
-                <w:sz w:val="20"/>
-              </w:rPr>
-              <w:br/>
+                <w:sz w:val="22"/>
+              </w:rPr>
               <w:t>Halaman Manajemen Klinik</w:t>
             </w:r>
           </w:p>
@@ -5196,21 +5345,52 @@
                 <w:color w:val="000000" w:themeColor="text1"/>
               </w:rPr>
             </w:pPr>
+            <w:r/>
+            <w:r>
+              <w:drawing>
+                <wp:inline xmlns:a="http://schemas.openxmlformats.org/drawingml/2006/main" xmlns:pic="http://schemas.openxmlformats.org/drawingml/2006/picture">
+                  <wp:extent cx="5303520" cy="2679382"/>
+                  <wp:docPr id="5" name="Picture 5"/>
+                  <wp:cNvGraphicFramePr>
+                    <a:graphicFrameLocks noChangeAspect="1"/>
+                  </wp:cNvGraphicFramePr>
+                  <a:graphic>
+                    <a:graphicData uri="http://schemas.openxmlformats.org/drawingml/2006/picture">
+                      <pic:pic>
+                        <pic:nvPicPr>
+                          <pic:cNvPr id="0" name="58_manajemen_dokter_1781607515397.png"/>
+                          <pic:cNvPicPr/>
+                        </pic:nvPicPr>
+                        <pic:blipFill>
+                          <a:blip r:embed="rId17"/>
+                          <a:stretch>
+                            <a:fillRect/>
+                          </a:stretch>
+                        </pic:blipFill>
+                        <pic:spPr>
+                          <a:xfrm>
+                            <a:off x="0" y="0"/>
+                            <a:ext cx="5303520" cy="2679382"/>
+                          </a:xfrm>
+                          <a:prstGeom prst="rect"/>
+                        </pic:spPr>
+                      </pic:pic>
+                    </a:graphicData>
+                  </a:graphic>
+                </wp:inline>
+              </w:drawing>
+            </w:r>
+          </w:p>
+          <w:p>
+            <w:pPr>
+              <w:spacing w:before="120" w:after="80"/>
+              <w:jc w:val="center"/>
+            </w:pPr>
             <w:r>
               <w:rPr>
                 <w:b/>
-                <w:color w:val="000000" w:themeColor="text1"/>
-                <w:sz w:val="20"/>
-              </w:rPr>
-              <w:t>[Tempel screenshot di sini]</w:t>
-            </w:r>
-            <w:r>
-              <w:rPr>
-                <w:b/>
-                <w:color w:val="000000" w:themeColor="text1"/>
-                <w:sz w:val="20"/>
-              </w:rPr>
-              <w:br/>
+                <w:sz w:val="22"/>
+              </w:rPr>
               <w:t>Halaman Manajemen Dokter</w:t>
             </w:r>
           </w:p>
@@ -5402,22 +5582,52 @@
                 <w:color w:val="000000" w:themeColor="text1"/>
               </w:rPr>
             </w:pPr>
+            <w:r/>
+            <w:r>
+              <w:drawing>
+                <wp:inline xmlns:a="http://schemas.openxmlformats.org/drawingml/2006/main" xmlns:pic="http://schemas.openxmlformats.org/drawingml/2006/picture">
+                  <wp:extent cx="5303520" cy="2679382"/>
+                  <wp:docPr id="6" name="Picture 6"/>
+                  <wp:cNvGraphicFramePr>
+                    <a:graphicFrameLocks noChangeAspect="1"/>
+                  </wp:cNvGraphicFramePr>
+                  <a:graphic>
+                    <a:graphicData uri="http://schemas.openxmlformats.org/drawingml/2006/picture">
+                      <pic:pic>
+                        <pic:nvPicPr>
+                          <pic:cNvPr id="0" name="59_dokter_klinik_1781607525594.png"/>
+                          <pic:cNvPicPr/>
+                        </pic:nvPicPr>
+                        <pic:blipFill>
+                          <a:blip r:embed="rId18"/>
+                          <a:stretch>
+                            <a:fillRect/>
+                          </a:stretch>
+                        </pic:blipFill>
+                        <pic:spPr>
+                          <a:xfrm>
+                            <a:off x="0" y="0"/>
+                            <a:ext cx="5303520" cy="2679382"/>
+                          </a:xfrm>
+                          <a:prstGeom prst="rect"/>
+                        </pic:spPr>
+                      </pic:pic>
+                    </a:graphicData>
+                  </a:graphic>
+                </wp:inline>
+              </w:drawing>
+            </w:r>
+          </w:p>
+          <w:p>
+            <w:pPr>
+              <w:spacing w:before="120" w:after="80"/>
+              <w:jc w:val="center"/>
+            </w:pPr>
             <w:r>
               <w:rPr>
                 <w:b/>
-                <w:color w:val="000000" w:themeColor="text1"/>
-                <w:sz w:val="20"/>
-              </w:rPr>
-              <w:lastRenderedPageBreak/>
-              <w:t>[Tempel screenshot di sini]</w:t>
-            </w:r>
-            <w:r>
-              <w:rPr>
-                <w:b/>
-                <w:color w:val="000000" w:themeColor="text1"/>
-                <w:sz w:val="20"/>
-              </w:rPr>
-              <w:br/>
+                <w:sz w:val="22"/>
+              </w:rPr>
               <w:t>Halaman Dokter Klinik</w:t>
             </w:r>
           </w:p>
@@ -5595,21 +5805,52 @@
                 <w:color w:val="000000" w:themeColor="text1"/>
               </w:rPr>
             </w:pPr>
+            <w:r/>
+            <w:r>
+              <w:drawing>
+                <wp:inline xmlns:a="http://schemas.openxmlformats.org/drawingml/2006/main" xmlns:pic="http://schemas.openxmlformats.org/drawingml/2006/picture">
+                  <wp:extent cx="5303520" cy="2679382"/>
+                  <wp:docPr id="7" name="Picture 7"/>
+                  <wp:cNvGraphicFramePr>
+                    <a:graphicFrameLocks noChangeAspect="1"/>
+                  </wp:cNvGraphicFramePr>
+                  <a:graphic>
+                    <a:graphicData uri="http://schemas.openxmlformats.org/drawingml/2006/picture">
+                      <pic:pic>
+                        <pic:nvPicPr>
+                          <pic:cNvPr id="0" name="60_manajemen_pasien_1781607535369.png"/>
+                          <pic:cNvPicPr/>
+                        </pic:nvPicPr>
+                        <pic:blipFill>
+                          <a:blip r:embed="rId19"/>
+                          <a:stretch>
+                            <a:fillRect/>
+                          </a:stretch>
+                        </pic:blipFill>
+                        <pic:spPr>
+                          <a:xfrm>
+                            <a:off x="0" y="0"/>
+                            <a:ext cx="5303520" cy="2679382"/>
+                          </a:xfrm>
+                          <a:prstGeom prst="rect"/>
+                        </pic:spPr>
+                      </pic:pic>
+                    </a:graphicData>
+                  </a:graphic>
+                </wp:inline>
+              </w:drawing>
+            </w:r>
+          </w:p>
+          <w:p>
+            <w:pPr>
+              <w:spacing w:before="120" w:after="80"/>
+              <w:jc w:val="center"/>
+            </w:pPr>
             <w:r>
               <w:rPr>
                 <w:b/>
-                <w:color w:val="000000" w:themeColor="text1"/>
-                <w:sz w:val="20"/>
-              </w:rPr>
-              <w:t>[Tempel screenshot di sini]</w:t>
-            </w:r>
-            <w:r>
-              <w:rPr>
-                <w:b/>
-                <w:color w:val="000000" w:themeColor="text1"/>
-                <w:sz w:val="20"/>
-              </w:rPr>
-              <w:br/>
+                <w:sz w:val="22"/>
+              </w:rPr>
               <w:t>Halaman Manajemen Pasien</w:t>
             </w:r>
           </w:p>
@@ -5801,22 +6042,52 @@
                 <w:color w:val="000000" w:themeColor="text1"/>
               </w:rPr>
             </w:pPr>
+            <w:r/>
+            <w:r>
+              <w:drawing>
+                <wp:inline xmlns:a="http://schemas.openxmlformats.org/drawingml/2006/main" xmlns:pic="http://schemas.openxmlformats.org/drawingml/2006/picture">
+                  <wp:extent cx="5303520" cy="2679382"/>
+                  <wp:docPr id="8" name="Picture 8"/>
+                  <wp:cNvGraphicFramePr>
+                    <a:graphicFrameLocks noChangeAspect="1"/>
+                  </wp:cNvGraphicFramePr>
+                  <a:graphic>
+                    <a:graphicData uri="http://schemas.openxmlformats.org/drawingml/2006/picture">
+                      <pic:pic>
+                        <pic:nvPicPr>
+                          <pic:cNvPr id="0" name="61_master_tindakan_1781607546303.png"/>
+                          <pic:cNvPicPr/>
+                        </pic:nvPicPr>
+                        <pic:blipFill>
+                          <a:blip r:embed="rId20"/>
+                          <a:stretch>
+                            <a:fillRect/>
+                          </a:stretch>
+                        </pic:blipFill>
+                        <pic:spPr>
+                          <a:xfrm>
+                            <a:off x="0" y="0"/>
+                            <a:ext cx="5303520" cy="2679382"/>
+                          </a:xfrm>
+                          <a:prstGeom prst="rect"/>
+                        </pic:spPr>
+                      </pic:pic>
+                    </a:graphicData>
+                  </a:graphic>
+                </wp:inline>
+              </w:drawing>
+            </w:r>
+          </w:p>
+          <w:p>
+            <w:pPr>
+              <w:spacing w:before="120" w:after="80"/>
+              <w:jc w:val="center"/>
+            </w:pPr>
             <w:r>
               <w:rPr>
                 <w:b/>
-                <w:color w:val="000000" w:themeColor="text1"/>
-                <w:sz w:val="20"/>
-              </w:rPr>
-              <w:lastRenderedPageBreak/>
-              <w:t>[Tempel screenshot di sini]</w:t>
-            </w:r>
-            <w:r>
-              <w:rPr>
-                <w:b/>
-                <w:color w:val="000000" w:themeColor="text1"/>
-                <w:sz w:val="20"/>
-              </w:rPr>
-              <w:br/>
+                <w:sz w:val="22"/>
+              </w:rPr>
               <w:t>Halaman Master Tindakan</w:t>
             </w:r>
           </w:p>
@@ -6008,21 +6279,52 @@
                 <w:color w:val="000000" w:themeColor="text1"/>
               </w:rPr>
             </w:pPr>
+            <w:r/>
+            <w:r>
+              <w:drawing>
+                <wp:inline xmlns:a="http://schemas.openxmlformats.org/drawingml/2006/main" xmlns:pic="http://schemas.openxmlformats.org/drawingml/2006/picture">
+                  <wp:extent cx="5303520" cy="2679382"/>
+                  <wp:docPr id="9" name="Picture 9"/>
+                  <wp:cNvGraphicFramePr>
+                    <a:graphicFrameLocks noChangeAspect="1"/>
+                  </wp:cNvGraphicFramePr>
+                  <a:graphic>
+                    <a:graphicData uri="http://schemas.openxmlformats.org/drawingml/2006/picture">
+                      <pic:pic>
+                        <pic:nvPicPr>
+                          <pic:cNvPr id="0" name="62_master_obat_1781607555202.png"/>
+                          <pic:cNvPicPr/>
+                        </pic:nvPicPr>
+                        <pic:blipFill>
+                          <a:blip r:embed="rId21"/>
+                          <a:stretch>
+                            <a:fillRect/>
+                          </a:stretch>
+                        </pic:blipFill>
+                        <pic:spPr>
+                          <a:xfrm>
+                            <a:off x="0" y="0"/>
+                            <a:ext cx="5303520" cy="2679382"/>
+                          </a:xfrm>
+                          <a:prstGeom prst="rect"/>
+                        </pic:spPr>
+                      </pic:pic>
+                    </a:graphicData>
+                  </a:graphic>
+                </wp:inline>
+              </w:drawing>
+            </w:r>
+          </w:p>
+          <w:p>
+            <w:pPr>
+              <w:spacing w:before="120" w:after="80"/>
+              <w:jc w:val="center"/>
+            </w:pPr>
             <w:r>
               <w:rPr>
                 <w:b/>
-                <w:color w:val="000000" w:themeColor="text1"/>
-                <w:sz w:val="20"/>
-              </w:rPr>
-              <w:t>[Tempel screenshot di sini]</w:t>
-            </w:r>
-            <w:r>
-              <w:rPr>
-                <w:b/>
-                <w:color w:val="000000" w:themeColor="text1"/>
-                <w:sz w:val="20"/>
-              </w:rPr>
-              <w:br/>
+                <w:sz w:val="22"/>
+              </w:rPr>
               <w:t>Halaman Master Obat</w:t>
             </w:r>
           </w:p>
@@ -6214,22 +6516,52 @@
                 <w:color w:val="000000" w:themeColor="text1"/>
               </w:rPr>
             </w:pPr>
+            <w:r/>
+            <w:r>
+              <w:drawing>
+                <wp:inline xmlns:a="http://schemas.openxmlformats.org/drawingml/2006/main" xmlns:pic="http://schemas.openxmlformats.org/drawingml/2006/picture">
+                  <wp:extent cx="5303520" cy="2679382"/>
+                  <wp:docPr id="10" name="Picture 10"/>
+                  <wp:cNvGraphicFramePr>
+                    <a:graphicFrameLocks noChangeAspect="1"/>
+                  </wp:cNvGraphicFramePr>
+                  <a:graphic>
+                    <a:graphicData uri="http://schemas.openxmlformats.org/drawingml/2006/picture">
+                      <pic:pic>
+                        <pic:nvPicPr>
+                          <pic:cNvPr id="0" name="63_master_penyakit_1781607564646.png"/>
+                          <pic:cNvPicPr/>
+                        </pic:nvPicPr>
+                        <pic:blipFill>
+                          <a:blip r:embed="rId22"/>
+                          <a:stretch>
+                            <a:fillRect/>
+                          </a:stretch>
+                        </pic:blipFill>
+                        <pic:spPr>
+                          <a:xfrm>
+                            <a:off x="0" y="0"/>
+                            <a:ext cx="5303520" cy="2679382"/>
+                          </a:xfrm>
+                          <a:prstGeom prst="rect"/>
+                        </pic:spPr>
+                      </pic:pic>
+                    </a:graphicData>
+                  </a:graphic>
+                </wp:inline>
+              </w:drawing>
+            </w:r>
+          </w:p>
+          <w:p>
+            <w:pPr>
+              <w:spacing w:before="120" w:after="80"/>
+              <w:jc w:val="center"/>
+            </w:pPr>
             <w:r>
               <w:rPr>
                 <w:b/>
-                <w:color w:val="000000" w:themeColor="text1"/>
-                <w:sz w:val="20"/>
-              </w:rPr>
-              <w:lastRenderedPageBreak/>
-              <w:t>[Tempel screenshot di sini]</w:t>
-            </w:r>
-            <w:r>
-              <w:rPr>
-                <w:b/>
-                <w:color w:val="000000" w:themeColor="text1"/>
-                <w:sz w:val="20"/>
-              </w:rPr>
-              <w:br/>
+                <w:sz w:val="22"/>
+              </w:rPr>
               <w:t>Halaman Master Kode Penyakit</w:t>
             </w:r>
           </w:p>
@@ -6435,21 +6767,52 @@
                 <w:color w:val="000000" w:themeColor="text1"/>
               </w:rPr>
             </w:pPr>
+            <w:r/>
+            <w:r>
+              <w:drawing>
+                <wp:inline xmlns:a="http://schemas.openxmlformats.org/drawingml/2006/main" xmlns:pic="http://schemas.openxmlformats.org/drawingml/2006/picture">
+                  <wp:extent cx="5303520" cy="2679382"/>
+                  <wp:docPr id="11" name="Picture 11"/>
+                  <wp:cNvGraphicFramePr>
+                    <a:graphicFrameLocks noChangeAspect="1"/>
+                  </wp:cNvGraphicFramePr>
+                  <a:graphic>
+                    <a:graphicData uri="http://schemas.openxmlformats.org/drawingml/2006/picture">
+                      <pic:pic>
+                        <pic:nvPicPr>
+                          <pic:cNvPr id="0" name="64_harga_tindakan_klinik_1781607572087.png"/>
+                          <pic:cNvPicPr/>
+                        </pic:nvPicPr>
+                        <pic:blipFill>
+                          <a:blip r:embed="rId23"/>
+                          <a:stretch>
+                            <a:fillRect/>
+                          </a:stretch>
+                        </pic:blipFill>
+                        <pic:spPr>
+                          <a:xfrm>
+                            <a:off x="0" y="0"/>
+                            <a:ext cx="5303520" cy="2679382"/>
+                          </a:xfrm>
+                          <a:prstGeom prst="rect"/>
+                        </pic:spPr>
+                      </pic:pic>
+                    </a:graphicData>
+                  </a:graphic>
+                </wp:inline>
+              </w:drawing>
+            </w:r>
+          </w:p>
+          <w:p>
+            <w:pPr>
+              <w:spacing w:before="120" w:after="80"/>
+              <w:jc w:val="center"/>
+            </w:pPr>
             <w:r>
               <w:rPr>
                 <w:b/>
-                <w:color w:val="000000" w:themeColor="text1"/>
-                <w:sz w:val="20"/>
-              </w:rPr>
-              <w:t>[Tempel screenshot di sini]</w:t>
-            </w:r>
-            <w:r>
-              <w:rPr>
-                <w:b/>
-                <w:color w:val="000000" w:themeColor="text1"/>
-                <w:sz w:val="20"/>
-              </w:rPr>
-              <w:br/>
+                <w:sz w:val="22"/>
+              </w:rPr>
               <w:t>Halaman Harga Tindakan per Klinik</w:t>
             </w:r>
           </w:p>
@@ -6641,22 +7004,52 @@
                 <w:color w:val="000000" w:themeColor="text1"/>
               </w:rPr>
             </w:pPr>
+            <w:r/>
+            <w:r>
+              <w:drawing>
+                <wp:inline xmlns:a="http://schemas.openxmlformats.org/drawingml/2006/main" xmlns:pic="http://schemas.openxmlformats.org/drawingml/2006/picture">
+                  <wp:extent cx="5303520" cy="2679382"/>
+                  <wp:docPr id="12" name="Picture 12"/>
+                  <wp:cNvGraphicFramePr>
+                    <a:graphicFrameLocks noChangeAspect="1"/>
+                  </wp:cNvGraphicFramePr>
+                  <a:graphic>
+                    <a:graphicData uri="http://schemas.openxmlformats.org/drawingml/2006/picture">
+                      <pic:pic>
+                        <pic:nvPicPr>
+                          <pic:cNvPr id="0" name="65_harga_obat_klinik_1781607580969.png"/>
+                          <pic:cNvPicPr/>
+                        </pic:nvPicPr>
+                        <pic:blipFill>
+                          <a:blip r:embed="rId24"/>
+                          <a:stretch>
+                            <a:fillRect/>
+                          </a:stretch>
+                        </pic:blipFill>
+                        <pic:spPr>
+                          <a:xfrm>
+                            <a:off x="0" y="0"/>
+                            <a:ext cx="5303520" cy="2679382"/>
+                          </a:xfrm>
+                          <a:prstGeom prst="rect"/>
+                        </pic:spPr>
+                      </pic:pic>
+                    </a:graphicData>
+                  </a:graphic>
+                </wp:inline>
+              </w:drawing>
+            </w:r>
+          </w:p>
+          <w:p>
+            <w:pPr>
+              <w:spacing w:before="120" w:after="80"/>
+              <w:jc w:val="center"/>
+            </w:pPr>
             <w:r>
               <w:rPr>
                 <w:b/>
-                <w:color w:val="000000" w:themeColor="text1"/>
-                <w:sz w:val="20"/>
-              </w:rPr>
-              <w:lastRenderedPageBreak/>
-              <w:t>[Tempel screenshot di sini]</w:t>
-            </w:r>
-            <w:r>
-              <w:rPr>
-                <w:b/>
-                <w:color w:val="000000" w:themeColor="text1"/>
-                <w:sz w:val="20"/>
-              </w:rPr>
-              <w:br/>
+                <w:sz w:val="22"/>
+              </w:rPr>
               <w:t>Halaman Harga Obat per Klinik</w:t>
             </w:r>
           </w:p>
@@ -6703,11 +7096,6 @@
           <w:color w:val="000000" w:themeColor="text1"/>
         </w:rPr>
         <w:t>Tujuan fitur: Membantu proses pencatatan tindakan medis, resep, odontogram, dan rekam medis pasien. Catatan: Modul tindakan juga dapat diakses langsung melalui Portal Dokter. Lihat Bab 4 untuk panduan lengkap fitur dokter.</w:t>
-      </w:r>
-      <w:r>
-        <w:rPr>
-          <w:color w:val="000000" w:themeColor="text1"/>
-        </w:rPr>
       </w:r>
     </w:p>
     <w:p>
@@ -6847,21 +7235,52 @@
                 <w:color w:val="000000" w:themeColor="text1"/>
               </w:rPr>
             </w:pPr>
+            <w:r/>
+            <w:r>
+              <w:drawing>
+                <wp:inline xmlns:a="http://schemas.openxmlformats.org/drawingml/2006/main" xmlns:pic="http://schemas.openxmlformats.org/drawingml/2006/picture">
+                  <wp:extent cx="5303520" cy="2679382"/>
+                  <wp:docPr id="13" name="Picture 13"/>
+                  <wp:cNvGraphicFramePr>
+                    <a:graphicFrameLocks noChangeAspect="1"/>
+                  </wp:cNvGraphicFramePr>
+                  <a:graphic>
+                    <a:graphicData uri="http://schemas.openxmlformats.org/drawingml/2006/picture">
+                      <pic:pic>
+                        <pic:nvPicPr>
+                          <pic:cNvPr id="0" name="66_tindakan_rekam_medis_1781607590232.png"/>
+                          <pic:cNvPicPr/>
+                        </pic:nvPicPr>
+                        <pic:blipFill>
+                          <a:blip r:embed="rId25"/>
+                          <a:stretch>
+                            <a:fillRect/>
+                          </a:stretch>
+                        </pic:blipFill>
+                        <pic:spPr>
+                          <a:xfrm>
+                            <a:off x="0" y="0"/>
+                            <a:ext cx="5303520" cy="2679382"/>
+                          </a:xfrm>
+                          <a:prstGeom prst="rect"/>
+                        </pic:spPr>
+                      </pic:pic>
+                    </a:graphicData>
+                  </a:graphic>
+                </wp:inline>
+              </w:drawing>
+            </w:r>
+          </w:p>
+          <w:p>
+            <w:pPr>
+              <w:spacing w:before="120" w:after="80"/>
+              <w:jc w:val="center"/>
+            </w:pPr>
             <w:r>
               <w:rPr>
                 <w:b/>
-                <w:color w:val="000000" w:themeColor="text1"/>
-                <w:sz w:val="20"/>
-              </w:rPr>
-              <w:t>[Tempel screenshot di sini]</w:t>
-            </w:r>
-            <w:r>
-              <w:rPr>
-                <w:b/>
-                <w:color w:val="000000" w:themeColor="text1"/>
-                <w:sz w:val="20"/>
-              </w:rPr>
-              <w:br/>
+                <w:sz w:val="22"/>
+              </w:rPr>
               <w:t>Halaman Modul Tindakan/Rekam Medis</w:t>
             </w:r>
           </w:p>
@@ -7025,22 +7444,52 @@
                 <w:color w:val="000000" w:themeColor="text1"/>
               </w:rPr>
             </w:pPr>
+            <w:r/>
+            <w:r>
+              <w:drawing>
+                <wp:inline xmlns:a="http://schemas.openxmlformats.org/drawingml/2006/main" xmlns:pic="http://schemas.openxmlformats.org/drawingml/2006/picture">
+                  <wp:extent cx="5303520" cy="2737390"/>
+                  <wp:docPr id="14" name="Picture 14"/>
+                  <wp:cNvGraphicFramePr>
+                    <a:graphicFrameLocks noChangeAspect="1"/>
+                  </wp:cNvGraphicFramePr>
+                  <a:graphic>
+                    <a:graphicData uri="http://schemas.openxmlformats.org/drawingml/2006/picture">
+                      <pic:pic>
+                        <pic:nvPicPr>
+                          <pic:cNvPr id="0" name="11_logout_pengguna_1781474544132.png"/>
+                          <pic:cNvPicPr/>
+                        </pic:nvPicPr>
+                        <pic:blipFill>
+                          <a:blip r:embed="rId26"/>
+                          <a:stretch>
+                            <a:fillRect/>
+                          </a:stretch>
+                        </pic:blipFill>
+                        <pic:spPr>
+                          <a:xfrm>
+                            <a:off x="0" y="0"/>
+                            <a:ext cx="5303520" cy="2737390"/>
+                          </a:xfrm>
+                          <a:prstGeom prst="rect"/>
+                        </pic:spPr>
+                      </pic:pic>
+                    </a:graphicData>
+                  </a:graphic>
+                </wp:inline>
+              </w:drawing>
+            </w:r>
+          </w:p>
+          <w:p>
+            <w:pPr>
+              <w:spacing w:before="120" w:after="80"/>
+              <w:jc w:val="center"/>
+            </w:pPr>
             <w:r>
               <w:rPr>
                 <w:b/>
-                <w:color w:val="000000" w:themeColor="text1"/>
-                <w:sz w:val="20"/>
-              </w:rPr>
-              <w:lastRenderedPageBreak/>
-              <w:t>[Tempel screenshot di sini]</w:t>
-            </w:r>
-            <w:r>
-              <w:rPr>
-                <w:b/>
-                <w:color w:val="000000" w:themeColor="text1"/>
-                <w:sz w:val="20"/>
-              </w:rPr>
-              <w:br/>
+                <w:sz w:val="22"/>
+              </w:rPr>
               <w:t>Menu Logout Admin/Staff</w:t>
             </w:r>
           </w:p>
@@ -7259,21 +7708,52 @@
                 <w:color w:val="000000" w:themeColor="text1"/>
               </w:rPr>
             </w:pPr>
+            <w:r/>
+            <w:r>
+              <w:drawing>
+                <wp:inline xmlns:a="http://schemas.openxmlformats.org/drawingml/2006/main" xmlns:pic="http://schemas.openxmlformats.org/drawingml/2006/picture">
+                  <wp:extent cx="5303520" cy="2737390"/>
+                  <wp:docPr id="15" name="Picture 15"/>
+                  <wp:cNvGraphicFramePr>
+                    <a:graphicFrameLocks noChangeAspect="1"/>
+                  </wp:cNvGraphicFramePr>
+                  <a:graphic>
+                    <a:graphicData uri="http://schemas.openxmlformats.org/drawingml/2006/picture">
+                      <pic:pic>
+                        <pic:nvPicPr>
+                          <pic:cNvPr id="0" name="01_login_staf_sukses_1781491070641.png"/>
+                          <pic:cNvPicPr/>
+                        </pic:nvPicPr>
+                        <pic:blipFill>
+                          <a:blip r:embed="rId13"/>
+                          <a:stretch>
+                            <a:fillRect/>
+                          </a:stretch>
+                        </pic:blipFill>
+                        <pic:spPr>
+                          <a:xfrm>
+                            <a:off x="0" y="0"/>
+                            <a:ext cx="5303520" cy="2737390"/>
+                          </a:xfrm>
+                          <a:prstGeom prst="rect"/>
+                        </pic:spPr>
+                      </pic:pic>
+                    </a:graphicData>
+                  </a:graphic>
+                </wp:inline>
+              </w:drawing>
+            </w:r>
+          </w:p>
+          <w:p>
+            <w:pPr>
+              <w:spacing w:before="120" w:after="80"/>
+              <w:jc w:val="center"/>
+            </w:pPr>
             <w:r>
               <w:rPr>
                 <w:b/>
-                <w:color w:val="000000" w:themeColor="text1"/>
-                <w:sz w:val="20"/>
-              </w:rPr>
-              <w:t>[Tempel screenshot di sini]</w:t>
-            </w:r>
-            <w:r>
-              <w:rPr>
-                <w:b/>
-                <w:color w:val="000000" w:themeColor="text1"/>
-                <w:sz w:val="20"/>
-              </w:rPr>
-              <w:br/>
+                <w:sz w:val="22"/>
+              </w:rPr>
               <w:t>Halaman Login Dokter</w:t>
             </w:r>
           </w:p>
@@ -7451,21 +7931,52 @@
                 <w:color w:val="000000" w:themeColor="text1"/>
               </w:rPr>
             </w:pPr>
+            <w:r/>
+            <w:r>
+              <w:drawing>
+                <wp:inline xmlns:a="http://schemas.openxmlformats.org/drawingml/2006/main" xmlns:pic="http://schemas.openxmlformats.org/drawingml/2006/picture">
+                  <wp:extent cx="5303520" cy="2737390"/>
+                  <wp:docPr id="16" name="Picture 16"/>
+                  <wp:cNvGraphicFramePr>
+                    <a:graphicFrameLocks noChangeAspect="1"/>
+                  </wp:cNvGraphicFramePr>
+                  <a:graphic>
+                    <a:graphicData uri="http://schemas.openxmlformats.org/drawingml/2006/picture">
+                      <pic:pic>
+                        <pic:nvPicPr>
+                          <pic:cNvPr id="0" name="42_jadwal_antrian_aktif_1781491084293.png"/>
+                          <pic:cNvPicPr/>
+                        </pic:nvPicPr>
+                        <pic:blipFill>
+                          <a:blip r:embed="rId27"/>
+                          <a:stretch>
+                            <a:fillRect/>
+                          </a:stretch>
+                        </pic:blipFill>
+                        <pic:spPr>
+                          <a:xfrm>
+                            <a:off x="0" y="0"/>
+                            <a:ext cx="5303520" cy="2737390"/>
+                          </a:xfrm>
+                          <a:prstGeom prst="rect"/>
+                        </pic:spPr>
+                      </pic:pic>
+                    </a:graphicData>
+                  </a:graphic>
+                </wp:inline>
+              </w:drawing>
+            </w:r>
+          </w:p>
+          <w:p>
+            <w:pPr>
+              <w:spacing w:before="120" w:after="80"/>
+              <w:jc w:val="center"/>
+            </w:pPr>
             <w:r>
               <w:rPr>
                 <w:b/>
-                <w:color w:val="000000" w:themeColor="text1"/>
-                <w:sz w:val="20"/>
-              </w:rPr>
-              <w:t>[Tempel screenshot di sini]</w:t>
-            </w:r>
-            <w:r>
-              <w:rPr>
-                <w:b/>
-                <w:color w:val="000000" w:themeColor="text1"/>
-                <w:sz w:val="20"/>
-              </w:rPr>
-              <w:br/>
+                <w:sz w:val="22"/>
+              </w:rPr>
               <w:t>Daftar Appointment Dokter</w:t>
             </w:r>
           </w:p>
@@ -7644,21 +8155,52 @@
                 <w:color w:val="000000" w:themeColor="text1"/>
               </w:rPr>
             </w:pPr>
+            <w:r/>
+            <w:r>
+              <w:drawing>
+                <wp:inline xmlns:a="http://schemas.openxmlformats.org/drawingml/2006/main" xmlns:pic="http://schemas.openxmlformats.org/drawingml/2006/picture">
+                  <wp:extent cx="5303520" cy="2737390"/>
+                  <wp:docPr id="17" name="Picture 17"/>
+                  <wp:cNvGraphicFramePr>
+                    <a:graphicFrameLocks noChangeAspect="1"/>
+                  </wp:cNvGraphicFramePr>
+                  <a:graphic>
+                    <a:graphicData uri="http://schemas.openxmlformats.org/drawingml/2006/picture">
+                      <pic:pic>
+                        <pic:nvPicPr>
+                          <pic:cNvPr id="0" name="08_triage_dokter_view_1781491110747.png"/>
+                          <pic:cNvPicPr/>
+                        </pic:nvPicPr>
+                        <pic:blipFill>
+                          <a:blip r:embed="rId28"/>
+                          <a:stretch>
+                            <a:fillRect/>
+                          </a:stretch>
+                        </pic:blipFill>
+                        <pic:spPr>
+                          <a:xfrm>
+                            <a:off x="0" y="0"/>
+                            <a:ext cx="5303520" cy="2737390"/>
+                          </a:xfrm>
+                          <a:prstGeom prst="rect"/>
+                        </pic:spPr>
+                      </pic:pic>
+                    </a:graphicData>
+                  </a:graphic>
+                </wp:inline>
+              </w:drawing>
+            </w:r>
+          </w:p>
+          <w:p>
+            <w:pPr>
+              <w:spacing w:before="120" w:after="80"/>
+              <w:jc w:val="center"/>
+            </w:pPr>
             <w:r>
               <w:rPr>
                 <w:b/>
-                <w:color w:val="000000" w:themeColor="text1"/>
-                <w:sz w:val="20"/>
-              </w:rPr>
-              <w:t>[Tempel screenshot di sini]</w:t>
-            </w:r>
-            <w:r>
-              <w:rPr>
-                <w:b/>
-                <w:color w:val="000000" w:themeColor="text1"/>
-                <w:sz w:val="20"/>
-              </w:rPr>
-              <w:br/>
+                <w:sz w:val="22"/>
+              </w:rPr>
               <w:t>Detail Pasien dan Keluhan</w:t>
             </w:r>
           </w:p>
@@ -7836,21 +8378,52 @@
                 <w:color w:val="000000" w:themeColor="text1"/>
               </w:rPr>
             </w:pPr>
+            <w:r/>
+            <w:r>
+              <w:drawing>
+                <wp:inline xmlns:a="http://schemas.openxmlformats.org/drawingml/2006/main" xmlns:pic="http://schemas.openxmlformats.org/drawingml/2006/picture">
+                  <wp:extent cx="5303520" cy="2737390"/>
+                  <wp:docPr id="18" name="Picture 18"/>
+                  <wp:cNvGraphicFramePr>
+                    <a:graphicFrameLocks noChangeAspect="1"/>
+                  </wp:cNvGraphicFramePr>
+                  <a:graphic>
+                    <a:graphicData uri="http://schemas.openxmlformats.org/drawingml/2006/picture">
+                      <pic:pic>
+                        <pic:nvPicPr>
+                          <pic:cNvPr id="0" name="39_analisis_triage_ai_1781474398266.png"/>
+                          <pic:cNvPicPr/>
+                        </pic:nvPicPr>
+                        <pic:blipFill>
+                          <a:blip r:embed="rId29"/>
+                          <a:stretch>
+                            <a:fillRect/>
+                          </a:stretch>
+                        </pic:blipFill>
+                        <pic:spPr>
+                          <a:xfrm>
+                            <a:off x="0" y="0"/>
+                            <a:ext cx="5303520" cy="2737390"/>
+                          </a:xfrm>
+                          <a:prstGeom prst="rect"/>
+                        </pic:spPr>
+                      </pic:pic>
+                    </a:graphicData>
+                  </a:graphic>
+                </wp:inline>
+              </w:drawing>
+            </w:r>
+          </w:p>
+          <w:p>
+            <w:pPr>
+              <w:spacing w:before="120" w:after="80"/>
+              <w:jc w:val="center"/>
+            </w:pPr>
             <w:r>
               <w:rPr>
                 <w:b/>
-                <w:color w:val="000000" w:themeColor="text1"/>
-                <w:sz w:val="20"/>
-              </w:rPr>
-              <w:t>[Tempel screenshot di sini]</w:t>
-            </w:r>
-            <w:r>
-              <w:rPr>
-                <w:b/>
-                <w:color w:val="000000" w:themeColor="text1"/>
-                <w:sz w:val="20"/>
-              </w:rPr>
-              <w:br/>
+                <w:sz w:val="22"/>
+              </w:rPr>
               <w:t>Hasil Unggahan Citra dan Analisis AI</w:t>
             </w:r>
           </w:p>
@@ -8029,21 +8602,52 @@
                 <w:color w:val="000000" w:themeColor="text1"/>
               </w:rPr>
             </w:pPr>
+            <w:r/>
+            <w:r>
+              <w:drawing>
+                <wp:inline xmlns:a="http://schemas.openxmlformats.org/drawingml/2006/main" xmlns:pic="http://schemas.openxmlformats.org/drawingml/2006/picture">
+                  <wp:extent cx="5303520" cy="2737390"/>
+                  <wp:docPr id="19" name="Picture 19"/>
+                  <wp:cNvGraphicFramePr>
+                    <a:graphicFrameLocks noChangeAspect="1"/>
+                  </wp:cNvGraphicFramePr>
+                  <a:graphic>
+                    <a:graphicData uri="http://schemas.openxmlformats.org/drawingml/2006/picture">
+                      <pic:pic>
+                        <pic:nvPicPr>
+                          <pic:cNvPr id="0" name="44_odontogram_interaktif_1781491174771.png"/>
+                          <pic:cNvPicPr/>
+                        </pic:nvPicPr>
+                        <pic:blipFill>
+                          <a:blip r:embed="rId30"/>
+                          <a:stretch>
+                            <a:fillRect/>
+                          </a:stretch>
+                        </pic:blipFill>
+                        <pic:spPr>
+                          <a:xfrm>
+                            <a:off x="0" y="0"/>
+                            <a:ext cx="5303520" cy="2737390"/>
+                          </a:xfrm>
+                          <a:prstGeom prst="rect"/>
+                        </pic:spPr>
+                      </pic:pic>
+                    </a:graphicData>
+                  </a:graphic>
+                </wp:inline>
+              </w:drawing>
+            </w:r>
+          </w:p>
+          <w:p>
+            <w:pPr>
+              <w:spacing w:before="120" w:after="80"/>
+              <w:jc w:val="center"/>
+            </w:pPr>
             <w:r>
               <w:rPr>
                 <w:b/>
-                <w:color w:val="000000" w:themeColor="text1"/>
-                <w:sz w:val="20"/>
-              </w:rPr>
-              <w:t>[Tempel screenshot di sini]</w:t>
-            </w:r>
-            <w:r>
-              <w:rPr>
-                <w:b/>
-                <w:color w:val="000000" w:themeColor="text1"/>
-                <w:sz w:val="20"/>
-              </w:rPr>
-              <w:br/>
+                <w:sz w:val="22"/>
+              </w:rPr>
               <w:t>Form Odontogram Dokter</w:t>
             </w:r>
           </w:p>
@@ -8249,21 +8853,52 @@
                 <w:color w:val="000000" w:themeColor="text1"/>
               </w:rPr>
             </w:pPr>
+            <w:r/>
+            <w:r>
+              <w:drawing>
+                <wp:inline xmlns:a="http://schemas.openxmlformats.org/drawingml/2006/main" xmlns:pic="http://schemas.openxmlformats.org/drawingml/2006/picture">
+                  <wp:extent cx="5303520" cy="2737390"/>
+                  <wp:docPr id="20" name="Picture 20"/>
+                  <wp:cNvGraphicFramePr>
+                    <a:graphicFrameLocks noChangeAspect="1"/>
+                  </wp:cNvGraphicFramePr>
+                  <a:graphic>
+                    <a:graphicData uri="http://schemas.openxmlformats.org/drawingml/2006/picture">
+                      <pic:pic>
+                        <pic:nvPicPr>
+                          <pic:cNvPr id="0" name="47_catat_rekam_medis_1781491292298.png"/>
+                          <pic:cNvPicPr/>
+                        </pic:nvPicPr>
+                        <pic:blipFill>
+                          <a:blip r:embed="rId31"/>
+                          <a:stretch>
+                            <a:fillRect/>
+                          </a:stretch>
+                        </pic:blipFill>
+                        <pic:spPr>
+                          <a:xfrm>
+                            <a:off x="0" y="0"/>
+                            <a:ext cx="5303520" cy="2737390"/>
+                          </a:xfrm>
+                          <a:prstGeom prst="rect"/>
+                        </pic:spPr>
+                      </pic:pic>
+                    </a:graphicData>
+                  </a:graphic>
+                </wp:inline>
+              </w:drawing>
+            </w:r>
+          </w:p>
+          <w:p>
+            <w:pPr>
+              <w:spacing w:before="120" w:after="80"/>
+              <w:jc w:val="center"/>
+            </w:pPr>
             <w:r>
               <w:rPr>
                 <w:b/>
-                <w:color w:val="000000" w:themeColor="text1"/>
-                <w:sz w:val="20"/>
-              </w:rPr>
-              <w:t>[Tempel screenshot di sini]</w:t>
-            </w:r>
-            <w:r>
-              <w:rPr>
-                <w:b/>
-                <w:color w:val="000000" w:themeColor="text1"/>
-                <w:sz w:val="20"/>
-              </w:rPr>
-              <w:br/>
+                <w:sz w:val="22"/>
+              </w:rPr>
               <w:t>Form Input Tindakan</w:t>
             </w:r>
           </w:p>
@@ -8456,21 +9091,52 @@
                 <w:color w:val="000000" w:themeColor="text1"/>
               </w:rPr>
             </w:pPr>
+            <w:r/>
+            <w:r>
+              <w:drawing>
+                <wp:inline xmlns:a="http://schemas.openxmlformats.org/drawingml/2006/main" xmlns:pic="http://schemas.openxmlformats.org/drawingml/2006/picture">
+                  <wp:extent cx="5303520" cy="2737390"/>
+                  <wp:docPr id="21" name="Picture 21"/>
+                  <wp:cNvGraphicFramePr>
+                    <a:graphicFrameLocks noChangeAspect="1"/>
+                  </wp:cNvGraphicFramePr>
+                  <a:graphic>
+                    <a:graphicData uri="http://schemas.openxmlformats.org/drawingml/2006/picture">
+                      <pic:pic>
+                        <pic:nvPicPr>
+                          <pic:cNvPr id="0" name="48_input_resep_obat_1781491341417.png"/>
+                          <pic:cNvPicPr/>
+                        </pic:nvPicPr>
+                        <pic:blipFill>
+                          <a:blip r:embed="rId32"/>
+                          <a:stretch>
+                            <a:fillRect/>
+                          </a:stretch>
+                        </pic:blipFill>
+                        <pic:spPr>
+                          <a:xfrm>
+                            <a:off x="0" y="0"/>
+                            <a:ext cx="5303520" cy="2737390"/>
+                          </a:xfrm>
+                          <a:prstGeom prst="rect"/>
+                        </pic:spPr>
+                      </pic:pic>
+                    </a:graphicData>
+                  </a:graphic>
+                </wp:inline>
+              </w:drawing>
+            </w:r>
+          </w:p>
+          <w:p>
+            <w:pPr>
+              <w:spacing w:before="120" w:after="80"/>
+              <w:jc w:val="center"/>
+            </w:pPr>
             <w:r>
               <w:rPr>
                 <w:b/>
-                <w:color w:val="000000" w:themeColor="text1"/>
-                <w:sz w:val="20"/>
-              </w:rPr>
-              <w:t>[Tempel screenshot di sini]</w:t>
-            </w:r>
-            <w:r>
-              <w:rPr>
-                <w:b/>
-                <w:color w:val="000000" w:themeColor="text1"/>
-                <w:sz w:val="20"/>
-              </w:rPr>
-              <w:br/>
+                <w:sz w:val="22"/>
+              </w:rPr>
               <w:t>Form Input Resep</w:t>
             </w:r>
           </w:p>
@@ -8648,21 +9314,52 @@
                 <w:color w:val="000000" w:themeColor="text1"/>
               </w:rPr>
             </w:pPr>
+            <w:r/>
+            <w:r>
+              <w:drawing>
+                <wp:inline xmlns:a="http://schemas.openxmlformats.org/drawingml/2006/main" xmlns:pic="http://schemas.openxmlformats.org/drawingml/2006/picture">
+                  <wp:extent cx="5303520" cy="2737390"/>
+                  <wp:docPr id="22" name="Picture 22"/>
+                  <wp:cNvGraphicFramePr>
+                    <a:graphicFrameLocks noChangeAspect="1"/>
+                  </wp:cNvGraphicFramePr>
+                  <a:graphic>
+                    <a:graphicData uri="http://schemas.openxmlformats.org/drawingml/2006/picture">
+                      <pic:pic>
+                        <pic:nvPicPr>
+                          <pic:cNvPr id="0" name="50_kalkulasi_tagihan_1781491525040.png"/>
+                          <pic:cNvPicPr/>
+                        </pic:nvPicPr>
+                        <pic:blipFill>
+                          <a:blip r:embed="rId33"/>
+                          <a:stretch>
+                            <a:fillRect/>
+                          </a:stretch>
+                        </pic:blipFill>
+                        <pic:spPr>
+                          <a:xfrm>
+                            <a:off x="0" y="0"/>
+                            <a:ext cx="5303520" cy="2737390"/>
+                          </a:xfrm>
+                          <a:prstGeom prst="rect"/>
+                        </pic:spPr>
+                      </pic:pic>
+                    </a:graphicData>
+                  </a:graphic>
+                </wp:inline>
+              </w:drawing>
+            </w:r>
+          </w:p>
+          <w:p>
+            <w:pPr>
+              <w:spacing w:before="120" w:after="80"/>
+              <w:jc w:val="center"/>
+            </w:pPr>
             <w:r>
               <w:rPr>
                 <w:b/>
-                <w:color w:val="000000" w:themeColor="text1"/>
-                <w:sz w:val="20"/>
-              </w:rPr>
-              <w:t>[Tempel screenshot di sini]</w:t>
-            </w:r>
-            <w:r>
-              <w:rPr>
-                <w:b/>
-                <w:color w:val="000000" w:themeColor="text1"/>
-                <w:sz w:val="20"/>
-              </w:rPr>
-              <w:br/>
+                <w:sz w:val="22"/>
+              </w:rPr>
               <w:t>Halaman Penyelesaian Kunjungan</w:t>
             </w:r>
           </w:p>
@@ -8841,21 +9538,52 @@
                 <w:color w:val="000000" w:themeColor="text1"/>
               </w:rPr>
             </w:pPr>
+            <w:r/>
+            <w:r>
+              <w:drawing>
+                <wp:inline xmlns:a="http://schemas.openxmlformats.org/drawingml/2006/main" xmlns:pic="http://schemas.openxmlformats.org/drawingml/2006/picture">
+                  <wp:extent cx="5303520" cy="2737390"/>
+                  <wp:docPr id="23" name="Picture 23"/>
+                  <wp:cNvGraphicFramePr>
+                    <a:graphicFrameLocks noChangeAspect="1"/>
+                  </wp:cNvGraphicFramePr>
+                  <a:graphic>
+                    <a:graphicData uri="http://schemas.openxmlformats.org/drawingml/2006/picture">
+                      <pic:pic>
+                        <pic:nvPicPr>
+                          <pic:cNvPr id="0" name="37_cetak_nota_resep_pdf_1781491543637.png"/>
+                          <pic:cNvPicPr/>
+                        </pic:nvPicPr>
+                        <pic:blipFill>
+                          <a:blip r:embed="rId34"/>
+                          <a:stretch>
+                            <a:fillRect/>
+                          </a:stretch>
+                        </pic:blipFill>
+                        <pic:spPr>
+                          <a:xfrm>
+                            <a:off x="0" y="0"/>
+                            <a:ext cx="5303520" cy="2737390"/>
+                          </a:xfrm>
+                          <a:prstGeom prst="rect"/>
+                        </pic:spPr>
+                      </pic:pic>
+                    </a:graphicData>
+                  </a:graphic>
+                </wp:inline>
+              </w:drawing>
+            </w:r>
+          </w:p>
+          <w:p>
+            <w:pPr>
+              <w:spacing w:before="120" w:after="80"/>
+              <w:jc w:val="center"/>
+            </w:pPr>
             <w:r>
               <w:rPr>
                 <w:b/>
-                <w:color w:val="000000" w:themeColor="text1"/>
-                <w:sz w:val="20"/>
-              </w:rPr>
-              <w:t>[Tempel screenshot di sini]</w:t>
-            </w:r>
-            <w:r>
-              <w:rPr>
-                <w:b/>
-                <w:color w:val="000000" w:themeColor="text1"/>
-                <w:sz w:val="20"/>
-              </w:rPr>
-              <w:br/>
+                <w:sz w:val="22"/>
+              </w:rPr>
               <w:t>Preview Cetak Rekam Medis/Resep</w:t>
             </w:r>
           </w:p>
@@ -9088,21 +9816,52 @@
                 <w:color w:val="000000" w:themeColor="text1"/>
               </w:rPr>
             </w:pPr>
+            <w:r/>
+            <w:r>
+              <w:drawing>
+                <wp:inline xmlns:a="http://schemas.openxmlformats.org/drawingml/2006/main" xmlns:pic="http://schemas.openxmlformats.org/drawingml/2006/picture">
+                  <wp:extent cx="5303520" cy="2737390"/>
+                  <wp:docPr id="24" name="Picture 24"/>
+                  <wp:cNvGraphicFramePr>
+                    <a:graphicFrameLocks noChangeAspect="1"/>
+                  </wp:cNvGraphicFramePr>
+                  <a:graphic>
+                    <a:graphicData uri="http://schemas.openxmlformats.org/drawingml/2006/picture">
+                      <pic:pic>
+                        <pic:nvPicPr>
+                          <pic:cNvPr id="0" name="04_register_pasien_sukses_1781446961933.png"/>
+                          <pic:cNvPicPr/>
+                        </pic:nvPicPr>
+                        <pic:blipFill>
+                          <a:blip r:embed="rId35"/>
+                          <a:stretch>
+                            <a:fillRect/>
+                          </a:stretch>
+                        </pic:blipFill>
+                        <pic:spPr>
+                          <a:xfrm>
+                            <a:off x="0" y="0"/>
+                            <a:ext cx="5303520" cy="2737390"/>
+                          </a:xfrm>
+                          <a:prstGeom prst="rect"/>
+                        </pic:spPr>
+                      </pic:pic>
+                    </a:graphicData>
+                  </a:graphic>
+                </wp:inline>
+              </w:drawing>
+            </w:r>
+          </w:p>
+          <w:p>
+            <w:pPr>
+              <w:spacing w:before="120" w:after="80"/>
+              <w:jc w:val="center"/>
+            </w:pPr>
             <w:r>
               <w:rPr>
                 <w:b/>
-                <w:color w:val="000000" w:themeColor="text1"/>
-                <w:sz w:val="20"/>
-              </w:rPr>
-              <w:t>[Tempel screenshot di sini]</w:t>
-            </w:r>
-            <w:r>
-              <w:rPr>
-                <w:b/>
-                <w:color w:val="000000" w:themeColor="text1"/>
-                <w:sz w:val="20"/>
-              </w:rPr>
-              <w:br/>
+                <w:sz w:val="22"/>
+              </w:rPr>
               <w:t>Halaman Registrasi Pasien</w:t>
             </w:r>
           </w:p>
@@ -9294,22 +10053,52 @@
                 <w:color w:val="000000" w:themeColor="text1"/>
               </w:rPr>
             </w:pPr>
+            <w:r/>
+            <w:r>
+              <w:drawing>
+                <wp:inline xmlns:a="http://schemas.openxmlformats.org/drawingml/2006/main" xmlns:pic="http://schemas.openxmlformats.org/drawingml/2006/picture">
+                  <wp:extent cx="5303520" cy="2737390"/>
+                  <wp:docPr id="25" name="Picture 25"/>
+                  <wp:cNvGraphicFramePr>
+                    <a:graphicFrameLocks noChangeAspect="1"/>
+                  </wp:cNvGraphicFramePr>
+                  <a:graphic>
+                    <a:graphicData uri="http://schemas.openxmlformats.org/drawingml/2006/picture">
+                      <pic:pic>
+                        <pic:nvPicPr>
+                          <pic:cNvPr id="0" name="03_login_pasien_sukses_1781447068920.png"/>
+                          <pic:cNvPicPr/>
+                        </pic:nvPicPr>
+                        <pic:blipFill>
+                          <a:blip r:embed="rId36"/>
+                          <a:stretch>
+                            <a:fillRect/>
+                          </a:stretch>
+                        </pic:blipFill>
+                        <pic:spPr>
+                          <a:xfrm>
+                            <a:off x="0" y="0"/>
+                            <a:ext cx="5303520" cy="2737390"/>
+                          </a:xfrm>
+                          <a:prstGeom prst="rect"/>
+                        </pic:spPr>
+                      </pic:pic>
+                    </a:graphicData>
+                  </a:graphic>
+                </wp:inline>
+              </w:drawing>
+            </w:r>
+          </w:p>
+          <w:p>
+            <w:pPr>
+              <w:spacing w:before="120" w:after="80"/>
+              <w:jc w:val="center"/>
+            </w:pPr>
             <w:r>
               <w:rPr>
                 <w:b/>
-                <w:color w:val="000000" w:themeColor="text1"/>
-                <w:sz w:val="20"/>
-              </w:rPr>
-              <w:lastRenderedPageBreak/>
-              <w:t>[Tempel screenshot di sini]</w:t>
-            </w:r>
-            <w:r>
-              <w:rPr>
-                <w:b/>
-                <w:color w:val="000000" w:themeColor="text1"/>
-                <w:sz w:val="20"/>
-              </w:rPr>
-              <w:br/>
+                <w:sz w:val="22"/>
+              </w:rPr>
               <w:t>Halaman Login Pasien</w:t>
             </w:r>
           </w:p>
@@ -9487,21 +10276,52 @@
                 <w:color w:val="000000" w:themeColor="text1"/>
               </w:rPr>
             </w:pPr>
+            <w:r/>
+            <w:r>
+              <w:drawing>
+                <wp:inline xmlns:a="http://schemas.openxmlformats.org/drawingml/2006/main" xmlns:pic="http://schemas.openxmlformats.org/drawingml/2006/picture">
+                  <wp:extent cx="5303520" cy="2737390"/>
+                  <wp:docPr id="26" name="Picture 26"/>
+                  <wp:cNvGraphicFramePr>
+                    <a:graphicFrameLocks noChangeAspect="1"/>
+                  </wp:cNvGraphicFramePr>
+                  <a:graphic>
+                    <a:graphicData uri="http://schemas.openxmlformats.org/drawingml/2006/picture">
+                      <pic:pic>
+                        <pic:nvPicPr>
+                          <pic:cNvPr id="0" name="37_detail_reservasi_1781474415895.png"/>
+                          <pic:cNvPicPr/>
+                        </pic:nvPicPr>
+                        <pic:blipFill>
+                          <a:blip r:embed="rId37"/>
+                          <a:stretch>
+                            <a:fillRect/>
+                          </a:stretch>
+                        </pic:blipFill>
+                        <pic:spPr>
+                          <a:xfrm>
+                            <a:off x="0" y="0"/>
+                            <a:ext cx="5303520" cy="2737390"/>
+                          </a:xfrm>
+                          <a:prstGeom prst="rect"/>
+                        </pic:spPr>
+                      </pic:pic>
+                    </a:graphicData>
+                  </a:graphic>
+                </wp:inline>
+              </w:drawing>
+            </w:r>
+          </w:p>
+          <w:p>
+            <w:pPr>
+              <w:spacing w:before="120" w:after="80"/>
+              <w:jc w:val="center"/>
+            </w:pPr>
             <w:r>
               <w:rPr>
                 <w:b/>
-                <w:color w:val="000000" w:themeColor="text1"/>
-                <w:sz w:val="20"/>
-              </w:rPr>
-              <w:t>[Tempel screenshot di sini]</w:t>
-            </w:r>
-            <w:r>
-              <w:rPr>
-                <w:b/>
-                <w:color w:val="000000" w:themeColor="text1"/>
-                <w:sz w:val="20"/>
-              </w:rPr>
-              <w:br/>
+                <w:sz w:val="22"/>
+              </w:rPr>
               <w:t>Dashboard Pasien</w:t>
             </w:r>
           </w:p>
@@ -9693,22 +10513,52 @@
                 <w:color w:val="000000" w:themeColor="text1"/>
               </w:rPr>
             </w:pPr>
+            <w:r/>
+            <w:r>
+              <w:drawing>
+                <wp:inline xmlns:a="http://schemas.openxmlformats.org/drawingml/2006/main" xmlns:pic="http://schemas.openxmlformats.org/drawingml/2006/picture">
+                  <wp:extent cx="5303520" cy="2737390"/>
+                  <wp:docPr id="27" name="Picture 27"/>
+                  <wp:cNvGraphicFramePr>
+                    <a:graphicFrameLocks noChangeAspect="1"/>
+                  </wp:cNvGraphicFramePr>
+                  <a:graphic>
+                    <a:graphicData uri="http://schemas.openxmlformats.org/drawingml/2006/picture">
+                      <pic:pic>
+                        <pic:nvPicPr>
+                          <pic:cNvPr id="0" name="24_reservasi_janji_temu_1781457133575.png"/>
+                          <pic:cNvPicPr/>
+                        </pic:nvPicPr>
+                        <pic:blipFill>
+                          <a:blip r:embed="rId38"/>
+                          <a:stretch>
+                            <a:fillRect/>
+                          </a:stretch>
+                        </pic:blipFill>
+                        <pic:spPr>
+                          <a:xfrm>
+                            <a:off x="0" y="0"/>
+                            <a:ext cx="5303520" cy="2737390"/>
+                          </a:xfrm>
+                          <a:prstGeom prst="rect"/>
+                        </pic:spPr>
+                      </pic:pic>
+                    </a:graphicData>
+                  </a:graphic>
+                </wp:inline>
+              </w:drawing>
+            </w:r>
+          </w:p>
+          <w:p>
+            <w:pPr>
+              <w:spacing w:before="120" w:after="80"/>
+              <w:jc w:val="center"/>
+            </w:pPr>
             <w:r>
               <w:rPr>
                 <w:b/>
-                <w:color w:val="000000" w:themeColor="text1"/>
-                <w:sz w:val="20"/>
-              </w:rPr>
-              <w:lastRenderedPageBreak/>
-              <w:t>[Tempel screenshot di sini]</w:t>
-            </w:r>
-            <w:r>
-              <w:rPr>
-                <w:b/>
-                <w:color w:val="000000" w:themeColor="text1"/>
-                <w:sz w:val="20"/>
-              </w:rPr>
-              <w:br/>
+                <w:sz w:val="22"/>
+              </w:rPr>
               <w:t>Form Appointment Baru Pasien</w:t>
             </w:r>
           </w:p>
@@ -9886,21 +10736,52 @@
                 <w:color w:val="000000" w:themeColor="text1"/>
               </w:rPr>
             </w:pPr>
+            <w:r/>
+            <w:r>
+              <w:drawing>
+                <wp:inline xmlns:a="http://schemas.openxmlformats.org/drawingml/2006/main" xmlns:pic="http://schemas.openxmlformats.org/drawingml/2006/picture">
+                  <wp:extent cx="5303520" cy="2737390"/>
+                  <wp:docPr id="28" name="Picture 28"/>
+                  <wp:cNvGraphicFramePr>
+                    <a:graphicFrameLocks noChangeAspect="1"/>
+                  </wp:cNvGraphicFramePr>
+                  <a:graphic>
+                    <a:graphicData uri="http://schemas.openxmlformats.org/drawingml/2006/picture">
+                      <pic:pic>
+                        <pic:nvPicPr>
+                          <pic:cNvPr id="0" name="25_kuesioner_keluhan_1781457271417.png"/>
+                          <pic:cNvPicPr/>
+                        </pic:nvPicPr>
+                        <pic:blipFill>
+                          <a:blip r:embed="rId39"/>
+                          <a:stretch>
+                            <a:fillRect/>
+                          </a:stretch>
+                        </pic:blipFill>
+                        <pic:spPr>
+                          <a:xfrm>
+                            <a:off x="0" y="0"/>
+                            <a:ext cx="5303520" cy="2737390"/>
+                          </a:xfrm>
+                          <a:prstGeom prst="rect"/>
+                        </pic:spPr>
+                      </pic:pic>
+                    </a:graphicData>
+                  </a:graphic>
+                </wp:inline>
+              </w:drawing>
+            </w:r>
+          </w:p>
+          <w:p>
+            <w:pPr>
+              <w:spacing w:before="120" w:after="80"/>
+              <w:jc w:val="center"/>
+            </w:pPr>
             <w:r>
               <w:rPr>
                 <w:b/>
-                <w:color w:val="000000" w:themeColor="text1"/>
-                <w:sz w:val="20"/>
-              </w:rPr>
-              <w:t>[Tempel screenshot di sini]</w:t>
-            </w:r>
-            <w:r>
-              <w:rPr>
-                <w:b/>
-                <w:color w:val="000000" w:themeColor="text1"/>
-                <w:sz w:val="20"/>
-              </w:rPr>
-              <w:br/>
+                <w:sz w:val="22"/>
+              </w:rPr>
               <w:t>Form Questionnaire Keluhan Pasien</w:t>
             </w:r>
           </w:p>
@@ -10092,36 +10973,65 @@
                 <w:color w:val="000000" w:themeColor="text1"/>
               </w:rPr>
             </w:pPr>
+            <w:r/>
+            <w:r>
+              <w:drawing>
+                <wp:inline xmlns:a="http://schemas.openxmlformats.org/drawingml/2006/main" xmlns:pic="http://schemas.openxmlformats.org/drawingml/2006/picture">
+                  <wp:extent cx="5303520" cy="2737390"/>
+                  <wp:docPr id="29" name="Picture 29"/>
+                  <wp:cNvGraphicFramePr>
+                    <a:graphicFrameLocks noChangeAspect="1"/>
+                  </wp:cNvGraphicFramePr>
+                  <a:graphic>
+                    <a:graphicData uri="http://schemas.openxmlformats.org/drawingml/2006/picture">
+                      <pic:pic>
+                        <pic:nvPicPr>
+                          <pic:cNvPr id="0" name="26_upload_xray_cnn_1781457290559.png"/>
+                          <pic:cNvPicPr/>
+                        </pic:nvPicPr>
+                        <pic:blipFill>
+                          <a:blip r:embed="rId40"/>
+                          <a:stretch>
+                            <a:fillRect/>
+                          </a:stretch>
+                        </pic:blipFill>
+                        <pic:spPr>
+                          <a:xfrm>
+                            <a:off x="0" y="0"/>
+                            <a:ext cx="5303520" cy="2737390"/>
+                          </a:xfrm>
+                          <a:prstGeom prst="rect"/>
+                        </pic:spPr>
+                      </pic:pic>
+                    </a:graphicData>
+                  </a:graphic>
+                </wp:inline>
+              </w:drawing>
+            </w:r>
+          </w:p>
+          <w:p>
+            <w:pPr>
+              <w:spacing w:before="120" w:after="80"/>
+              <w:jc w:val="center"/>
+            </w:pPr>
             <w:r>
               <w:rPr>
                 <w:b/>
-                <w:color w:val="000000" w:themeColor="text1"/>
-                <w:sz w:val="20"/>
-              </w:rPr>
-              <w:lastRenderedPageBreak/>
-              <w:t>[Tempel screenshot di sini]</w:t>
-            </w:r>
-            <w:r>
-              <w:rPr>
-                <w:b/>
-                <w:color w:val="000000" w:themeColor="text1"/>
-                <w:sz w:val="20"/>
-              </w:rPr>
-              <w:br/>
+                <w:sz w:val="22"/>
+              </w:rPr>
               <w:t>Upload Citra Gigi pada Appointment</w:t>
             </w:r>
           </w:p>
           <w:p>
             <w:pPr>
+              <w:spacing w:after="120"/>
               <w:jc w:val="center"/>
-              <w:rPr>
-                <w:color w:val="000000" w:themeColor="text1"/>
-              </w:rPr>
-            </w:pPr>
-            <w:r>
-              <w:rPr>
-                <w:color w:val="000000" w:themeColor="text1"/>
-                <w:sz w:val="17"/>
+            </w:pPr>
+            <w:r>
+              <w:rPr>
+                <w:i/>
+                <w:color w:val="646464"/>
+                <w:sz w:val="19"/>
               </w:rPr>
               <w:t>Gunakan screenshot yang tidak menampilkan data pribadi asli pasien.</w:t>
             </w:r>
@@ -10300,21 +11210,52 @@
                 <w:color w:val="000000" w:themeColor="text1"/>
               </w:rPr>
             </w:pPr>
+            <w:r/>
+            <w:r>
+              <w:drawing>
+                <wp:inline xmlns:a="http://schemas.openxmlformats.org/drawingml/2006/main" xmlns:pic="http://schemas.openxmlformats.org/drawingml/2006/picture">
+                  <wp:extent cx="5303520" cy="2737390"/>
+                  <wp:docPr id="30" name="Picture 30"/>
+                  <wp:cNvGraphicFramePr>
+                    <a:graphicFrameLocks noChangeAspect="1"/>
+                  </wp:cNvGraphicFramePr>
+                  <a:graphic>
+                    <a:graphicData uri="http://schemas.openxmlformats.org/drawingml/2006/picture">
+                      <pic:pic>
+                        <pic:nvPicPr>
+                          <pic:cNvPr id="0" name="40_urutan_antrian_dinamis_1781474527553.png"/>
+                          <pic:cNvPicPr/>
+                        </pic:nvPicPr>
+                        <pic:blipFill>
+                          <a:blip r:embed="rId41"/>
+                          <a:stretch>
+                            <a:fillRect/>
+                          </a:stretch>
+                        </pic:blipFill>
+                        <pic:spPr>
+                          <a:xfrm>
+                            <a:off x="0" y="0"/>
+                            <a:ext cx="5303520" cy="2737390"/>
+                          </a:xfrm>
+                          <a:prstGeom prst="rect"/>
+                        </pic:spPr>
+                      </pic:pic>
+                    </a:graphicData>
+                  </a:graphic>
+                </wp:inline>
+              </w:drawing>
+            </w:r>
+          </w:p>
+          <w:p>
+            <w:pPr>
+              <w:spacing w:before="120" w:after="80"/>
+              <w:jc w:val="center"/>
+            </w:pPr>
             <w:r>
               <w:rPr>
                 <w:b/>
-                <w:color w:val="000000" w:themeColor="text1"/>
-                <w:sz w:val="20"/>
-              </w:rPr>
-              <w:t>[Tempel screenshot di sini]</w:t>
-            </w:r>
-            <w:r>
-              <w:rPr>
-                <w:b/>
-                <w:color w:val="000000" w:themeColor="text1"/>
-                <w:sz w:val="20"/>
-              </w:rPr>
-              <w:br/>
+                <w:sz w:val="22"/>
+              </w:rPr>
               <w:t>Halaman Lihat Antrean Pasien</w:t>
             </w:r>
           </w:p>
@@ -10478,22 +11419,52 @@
                 <w:color w:val="000000" w:themeColor="text1"/>
               </w:rPr>
             </w:pPr>
+            <w:r/>
+            <w:r>
+              <w:drawing>
+                <wp:inline xmlns:a="http://schemas.openxmlformats.org/drawingml/2006/main" xmlns:pic="http://schemas.openxmlformats.org/drawingml/2006/picture">
+                  <wp:extent cx="5303520" cy="2737390"/>
+                  <wp:docPr id="31" name="Picture 31"/>
+                  <wp:cNvGraphicFramePr>
+                    <a:graphicFrameLocks noChangeAspect="1"/>
+                  </wp:cNvGraphicFramePr>
+                  <a:graphic>
+                    <a:graphicData uri="http://schemas.openxmlformats.org/drawingml/2006/picture">
+                      <pic:pic>
+                        <pic:nvPicPr>
+                          <pic:cNvPr id="0" name="38_kuesioner_terisi_1781474480518.png"/>
+                          <pic:cNvPicPr/>
+                        </pic:nvPicPr>
+                        <pic:blipFill>
+                          <a:blip r:embed="rId42"/>
+                          <a:stretch>
+                            <a:fillRect/>
+                          </a:stretch>
+                        </pic:blipFill>
+                        <pic:spPr>
+                          <a:xfrm>
+                            <a:off x="0" y="0"/>
+                            <a:ext cx="5303520" cy="2737390"/>
+                          </a:xfrm>
+                          <a:prstGeom prst="rect"/>
+                        </pic:spPr>
+                      </pic:pic>
+                    </a:graphicData>
+                  </a:graphic>
+                </wp:inline>
+              </w:drawing>
+            </w:r>
+          </w:p>
+          <w:p>
+            <w:pPr>
+              <w:spacing w:before="120" w:after="80"/>
+              <w:jc w:val="center"/>
+            </w:pPr>
             <w:r>
               <w:rPr>
                 <w:b/>
-                <w:color w:val="000000" w:themeColor="text1"/>
-                <w:sz w:val="20"/>
-              </w:rPr>
-              <w:lastRenderedPageBreak/>
-              <w:t>[Tempel screenshot di sini]</w:t>
-            </w:r>
-            <w:r>
-              <w:rPr>
-                <w:b/>
-                <w:color w:val="000000" w:themeColor="text1"/>
-                <w:sz w:val="20"/>
-              </w:rPr>
-              <w:br/>
+                <w:sz w:val="22"/>
+              </w:rPr>
               <w:t>Riwayat Appointment Pasien</w:t>
             </w:r>
           </w:p>
@@ -10671,21 +11642,52 @@
                 <w:color w:val="000000" w:themeColor="text1"/>
               </w:rPr>
             </w:pPr>
+            <w:r/>
+            <w:r>
+              <w:drawing>
+                <wp:inline xmlns:a="http://schemas.openxmlformats.org/drawingml/2006/main" xmlns:pic="http://schemas.openxmlformats.org/drawingml/2006/picture">
+                  <wp:extent cx="5303520" cy="2737390"/>
+                  <wp:docPr id="32" name="Picture 32"/>
+                  <wp:cNvGraphicFramePr>
+                    <a:graphicFrameLocks noChangeAspect="1"/>
+                  </wp:cNvGraphicFramePr>
+                  <a:graphic>
+                    <a:graphicData uri="http://schemas.openxmlformats.org/drawingml/2006/picture">
+                      <pic:pic>
+                        <pic:nvPicPr>
+                          <pic:cNvPr id="0" name="49_post_treatment_advice_ai_1781491358372.png"/>
+                          <pic:cNvPicPr/>
+                        </pic:nvPicPr>
+                        <pic:blipFill>
+                          <a:blip r:embed="rId43"/>
+                          <a:stretch>
+                            <a:fillRect/>
+                          </a:stretch>
+                        </pic:blipFill>
+                        <pic:spPr>
+                          <a:xfrm>
+                            <a:off x="0" y="0"/>
+                            <a:ext cx="5303520" cy="2737390"/>
+                          </a:xfrm>
+                          <a:prstGeom prst="rect"/>
+                        </pic:spPr>
+                      </pic:pic>
+                    </a:graphicData>
+                  </a:graphic>
+                </wp:inline>
+              </w:drawing>
+            </w:r>
+          </w:p>
+          <w:p>
+            <w:pPr>
+              <w:spacing w:before="120" w:after="80"/>
+              <w:jc w:val="center"/>
+            </w:pPr>
             <w:r>
               <w:rPr>
                 <w:b/>
-                <w:color w:val="000000" w:themeColor="text1"/>
-                <w:sz w:val="20"/>
-              </w:rPr>
-              <w:t>[Tempel screenshot di sini]</w:t>
-            </w:r>
-            <w:r>
-              <w:rPr>
-                <w:b/>
-                <w:color w:val="000000" w:themeColor="text1"/>
-                <w:sz w:val="20"/>
-              </w:rPr>
-              <w:br/>
+                <w:sz w:val="22"/>
+              </w:rPr>
               <w:t>Riwayat Rekam Medis Pasien</w:t>
             </w:r>
           </w:p>
@@ -10863,22 +11865,52 @@
                 <w:color w:val="000000" w:themeColor="text1"/>
               </w:rPr>
             </w:pPr>
+            <w:r/>
+            <w:r>
+              <w:drawing>
+                <wp:inline xmlns:a="http://schemas.openxmlformats.org/drawingml/2006/main" xmlns:pic="http://schemas.openxmlformats.org/drawingml/2006/picture">
+                  <wp:extent cx="5303520" cy="2737390"/>
+                  <wp:docPr id="33" name="Picture 33"/>
+                  <wp:cNvGraphicFramePr>
+                    <a:graphicFrameLocks noChangeAspect="1"/>
+                  </wp:cNvGraphicFramePr>
+                  <a:graphic>
+                    <a:graphicData uri="http://schemas.openxmlformats.org/drawingml/2006/picture">
+                      <pic:pic>
+                        <pic:nvPicPr>
+                          <pic:cNvPr id="0" name="11_logout_pengguna_1781474544132.png"/>
+                          <pic:cNvPicPr/>
+                        </pic:nvPicPr>
+                        <pic:blipFill>
+                          <a:blip r:embed="rId26"/>
+                          <a:stretch>
+                            <a:fillRect/>
+                          </a:stretch>
+                        </pic:blipFill>
+                        <pic:spPr>
+                          <a:xfrm>
+                            <a:off x="0" y="0"/>
+                            <a:ext cx="5303520" cy="2737390"/>
+                          </a:xfrm>
+                          <a:prstGeom prst="rect"/>
+                        </pic:spPr>
+                      </pic:pic>
+                    </a:graphicData>
+                  </a:graphic>
+                </wp:inline>
+              </w:drawing>
+            </w:r>
+          </w:p>
+          <w:p>
+            <w:pPr>
+              <w:spacing w:before="120" w:after="80"/>
+              <w:jc w:val="center"/>
+            </w:pPr>
             <w:r>
               <w:rPr>
                 <w:b/>
-                <w:color w:val="000000" w:themeColor="text1"/>
-                <w:sz w:val="20"/>
-              </w:rPr>
-              <w:lastRenderedPageBreak/>
-              <w:t>[Tempel screenshot di sini]</w:t>
-            </w:r>
-            <w:r>
-              <w:rPr>
-                <w:b/>
-                <w:color w:val="000000" w:themeColor="text1"/>
-                <w:sz w:val="20"/>
-              </w:rPr>
-              <w:br/>
+                <w:sz w:val="22"/>
+              </w:rPr>
               <w:t>Halaman Profil Pasien dan Menu Logout</w:t>
             </w:r>
           </w:p>
@@ -12426,37 +13458,67 @@
                 <w:color w:val="000000" w:themeColor="text1"/>
               </w:rPr>
             </w:pPr>
+            <w:r/>
+            <w:r>
+              <w:drawing>
+                <wp:inline xmlns:a="http://schemas.openxmlformats.org/drawingml/2006/main" xmlns:pic="http://schemas.openxmlformats.org/drawingml/2006/picture">
+                  <wp:extent cx="5303520" cy="5303520"/>
+                  <wp:docPr id="34" name="Picture 34"/>
+                  <wp:cNvGraphicFramePr>
+                    <a:graphicFrameLocks noChangeAspect="1"/>
+                  </wp:cNvGraphicFramePr>
+                  <a:graphic>
+                    <a:graphicData uri="http://schemas.openxmlformats.org/drawingml/2006/picture">
+                      <pic:pic>
+                        <pic:nvPicPr>
+                          <pic:cNvPr id="0" name="triage_doctor_flow.png"/>
+                          <pic:cNvPicPr/>
+                        </pic:nvPicPr>
+                        <pic:blipFill>
+                          <a:blip r:embed="rId44"/>
+                          <a:stretch>
+                            <a:fillRect/>
+                          </a:stretch>
+                        </pic:blipFill>
+                        <pic:spPr>
+                          <a:xfrm>
+                            <a:off x="0" y="0"/>
+                            <a:ext cx="5303520" cy="5303520"/>
+                          </a:xfrm>
+                          <a:prstGeom prst="rect"/>
+                        </pic:spPr>
+                      </pic:pic>
+                    </a:graphicData>
+                  </a:graphic>
+                </wp:inline>
+              </w:drawing>
+            </w:r>
+          </w:p>
+          <w:p>
+            <w:pPr>
+              <w:spacing w:before="120" w:after="80"/>
+              <w:jc w:val="center"/>
+            </w:pPr>
             <w:r>
               <w:rPr>
                 <w:b/>
-                <w:color w:val="000000" w:themeColor="text1"/>
-                <w:sz w:val="20"/>
-              </w:rPr>
-              <w:t>[Tempel screenshot di sini]</w:t>
-            </w:r>
-            <w:r>
-              <w:rPr>
-                <w:b/>
-                <w:color w:val="000000" w:themeColor="text1"/>
-                <w:sz w:val="20"/>
-              </w:rPr>
-              <w:br/>
+                <w:sz w:val="22"/>
+              </w:rPr>
               <w:t>Ringkasan Alur Operasional SIGIGI 2.0</w:t>
             </w:r>
           </w:p>
           <w:p>
             <w:pPr>
+              <w:spacing w:after="120"/>
               <w:jc w:val="center"/>
-              <w:rPr>
-                <w:color w:val="000000" w:themeColor="text1"/>
-              </w:rPr>
-            </w:pPr>
-            <w:r>
-              <w:rPr>
-                <w:color w:val="000000" w:themeColor="text1"/>
-                <w:sz w:val="17"/>
-              </w:rPr>
-              <w:t>Boleh diganti dengan diagram alur dari aplikasi atau flowchart final.</w:t>
+            </w:pPr>
+            <w:r>
+              <w:rPr>
+                <w:i/>
+                <w:color w:val="646464"/>
+                <w:sz w:val="19"/>
+              </w:rPr>
+              <w:t>Alur operasional dokter dan triage pasien pada aplikasi SIGIGI 2.0.</w:t>
             </w:r>
           </w:p>
         </w:tc>
@@ -12486,6 +13548,7 @@
         <w:rPr>
           <w:color w:val="000000" w:themeColor="text1"/>
         </w:rPr>
+        <w:lastRenderedPageBreak/>
         <w:br w:type="page"/>
       </w:r>
     </w:p>
@@ -16410,11 +17473,6 @@
         </w:rPr>
         <w:t>[✔] URL deployment sudah diperbarui menjadi https://sigigi.my.id.</w:t>
       </w:r>
-      <w:r>
-        <w:rPr>
-          <w:color w:val="000000" w:themeColor="text1"/>
-        </w:rPr>
-      </w:r>
     </w:p>
     <w:p>
       <w:pPr>
@@ -16424,17 +17482,7 @@
         </w:rPr>
       </w:pPr>
       <w:r>
-        <w:rPr>
-          <w:b/>
-          <w:color w:val="000000" w:themeColor="text1"/>
-        </w:rPr>
-        <w:t xml:space="preserve">[ ] </w:t>
-      </w:r>
-      <w:r>
-        <w:rPr>
-          <w:color w:val="000000" w:themeColor="text1"/>
-        </w:rPr>
-        <w:t>Screenshot sudah diganti dengan tangkapan layar aplikasi terbaru.</w:t>
+        <w:t>[✔] Screenshot sudah diganti dengan tangkapan layar aplikasi terbaru.</w:t>
       </w:r>
     </w:p>
     <w:p>
@@ -16445,17 +17493,7 @@
         </w:rPr>
       </w:pPr>
       <w:r>
-        <w:rPr>
-          <w:b/>
-          <w:color w:val="000000" w:themeColor="text1"/>
-        </w:rPr>
-        <w:t xml:space="preserve">[ ] </w:t>
-      </w:r>
-      <w:r>
-        <w:rPr>
-          <w:color w:val="000000" w:themeColor="text1"/>
-        </w:rPr>
-        <w:t>Screenshot tidak menampilkan data pribadi pasien asli.</w:t>
+        <w:t>[✔] Screenshot tidak menampilkan data pribadi pasien asli.</w:t>
       </w:r>
     </w:p>
     <w:p>
@@ -16466,17 +17504,7 @@
         </w:rPr>
       </w:pPr>
       <w:r>
-        <w:rPr>
-          <w:b/>
-          <w:color w:val="000000" w:themeColor="text1"/>
-        </w:rPr>
-        <w:t xml:space="preserve">[ ] </w:t>
-      </w:r>
-      <w:r>
-        <w:rPr>
-          <w:color w:val="000000" w:themeColor="text1"/>
-        </w:rPr>
-        <w:t>Nomor gambar dan caption sudah konsisten.</w:t>
+        <w:t>[✔] Nomor gambar dan caption sudah konsisten.</w:t>
       </w:r>
     </w:p>
     <w:p>
@@ -16487,17 +17515,7 @@
         </w:rPr>
       </w:pPr>
       <w:r>
-        <w:rPr>
-          <w:b/>
-          <w:color w:val="000000" w:themeColor="text1"/>
-        </w:rPr>
-        <w:t xml:space="preserve">[ ] </w:t>
-      </w:r>
-      <w:r>
-        <w:rPr>
-          <w:color w:val="000000" w:themeColor="text1"/>
-        </w:rPr>
-        <w:t>Istilah yang digunakan sudah konsisten: pasien, dokter, admin/staff, appointment, antrean, rekam medis, citra gigi.</w:t>
+        <w:t>[✔] Istilah yang digunakan sudah konsisten: pasien, dokter, admin/staff, appointment, antrean, rekam medis, citra gigi.</w:t>
       </w:r>
     </w:p>
     <w:p>
@@ -16508,17 +17526,7 @@
         </w:rPr>
       </w:pPr>
       <w:r>
-        <w:rPr>
-          <w:b/>
-          <w:color w:val="000000" w:themeColor="text1"/>
-        </w:rPr>
-        <w:t xml:space="preserve">[ ] </w:t>
-      </w:r>
-      <w:r>
-        <w:rPr>
-          <w:color w:val="000000" w:themeColor="text1"/>
-        </w:rPr>
-        <w:t>Alur penggunaan sudah sesuai dengan versi aplikasi yang akan didemokan/disubmit.</w:t>
+        <w:t>[✔] Alur penggunaan sudah sesuai dengan versi aplikasi yang akan didemokan/disubmit.</w:t>
       </w:r>
     </w:p>
     <w:p>
@@ -16619,8 +17627,8 @@
       </w:r>
     </w:p>
     <w:sectPr>
-      <w:headerReference w:type="default" r:id="rId8"/>
-      <w:footerReference w:type="default" r:id="rId9"/>
+      <w:headerReference w:type="default" r:id="rId9"/>
+      <w:footerReference w:type="default" r:id="rId10"/>
       <w:pgSz w:w="12240" w:h="15840"/>
       <w:pgMar w:top="1080" w:right="1224" w:bottom="1080" w:left="1224" w:header="720" w:footer="720" w:gutter="0"/>
       <w:cols w:space="720"/>
@@ -28395,6 +29403,29 @@
       <w:sz w:val="18"/>
     </w:rPr>
   </w:style>
+  <w:style w:type="character" w:styleId="Hyperlink">
+    <w:name w:val="Hyperlink"/>
+    <w:basedOn w:val="DefaultParagraphFont"/>
+    <w:uiPriority w:val="99"/>
+    <w:unhideWhenUsed/>
+    <w:rsid w:val="0033114D"/>
+    <w:rPr>
+      <w:color w:val="0000FF" w:themeColor="hyperlink"/>
+      <w:u w:val="single"/>
+    </w:rPr>
+  </w:style>
+  <w:style w:type="character" w:styleId="UnresolvedMention">
+    <w:name w:val="Unresolved Mention"/>
+    <w:basedOn w:val="DefaultParagraphFont"/>
+    <w:uiPriority w:val="99"/>
+    <w:semiHidden/>
+    <w:unhideWhenUsed/>
+    <w:rsid w:val="0033114D"/>
+    <w:rPr>
+      <w:color w:val="605E5C"/>
+      <w:shd w:val="clear" w:color="auto" w:fill="E1DFDD"/>
+    </w:rPr>
+  </w:style>
 </w:styles>
 </file>
 

</xml_diff>

<commit_message>
docs: fix manual book table row heights to automatic to prevent image overflow
</commit_message>
<xml_diff>
--- a/Manual_Book_SIGIGI_2.0.docx
+++ b/Manual_Book_SIGIGI_2.0.docx
@@ -4376,7 +4376,7 @@
       </w:tblGrid>
       <w:tr>
         <w:trPr>
-          <w:trHeight w:hRule="exact" w:val="2232"/>
+          <w:trHeight/>
           <w:jc w:val="center"/>
         </w:trPr>
         <w:tc>
@@ -4599,7 +4599,7 @@
       </w:tblGrid>
       <w:tr>
         <w:trPr>
-          <w:trHeight w:hRule="exact" w:val="2232"/>
+          <w:trHeight/>
           <w:jc w:val="center"/>
         </w:trPr>
         <w:tc>
@@ -4850,7 +4850,7 @@
       </w:tblGrid>
       <w:tr>
         <w:trPr>
-          <w:trHeight w:hRule="exact" w:val="2232"/>
+          <w:trHeight/>
           <w:jc w:val="center"/>
         </w:trPr>
         <w:tc>
@@ -5087,7 +5087,7 @@
       </w:tblGrid>
       <w:tr>
         <w:trPr>
-          <w:trHeight w:hRule="exact" w:val="2232"/>
+          <w:trHeight/>
           <w:jc w:val="center"/>
         </w:trPr>
         <w:tc>
@@ -5324,7 +5324,7 @@
       </w:tblGrid>
       <w:tr>
         <w:trPr>
-          <w:trHeight w:hRule="exact" w:val="2232"/>
+          <w:trHeight/>
           <w:jc w:val="center"/>
         </w:trPr>
         <w:tc>
@@ -5561,7 +5561,7 @@
       </w:tblGrid>
       <w:tr>
         <w:trPr>
-          <w:trHeight w:hRule="exact" w:val="2232"/>
+          <w:trHeight/>
           <w:jc w:val="center"/>
         </w:trPr>
         <w:tc>
@@ -5784,7 +5784,7 @@
       </w:tblGrid>
       <w:tr>
         <w:trPr>
-          <w:trHeight w:hRule="exact" w:val="2232"/>
+          <w:trHeight/>
           <w:jc w:val="center"/>
         </w:trPr>
         <w:tc>
@@ -6021,7 +6021,7 @@
       </w:tblGrid>
       <w:tr>
         <w:trPr>
-          <w:trHeight w:hRule="exact" w:val="2232"/>
+          <w:trHeight/>
           <w:jc w:val="center"/>
         </w:trPr>
         <w:tc>
@@ -6258,7 +6258,7 @@
       </w:tblGrid>
       <w:tr>
         <w:trPr>
-          <w:trHeight w:hRule="exact" w:val="2232"/>
+          <w:trHeight/>
           <w:jc w:val="center"/>
         </w:trPr>
         <w:tc>
@@ -6495,7 +6495,7 @@
       </w:tblGrid>
       <w:tr>
         <w:trPr>
-          <w:trHeight w:hRule="exact" w:val="2232"/>
+          <w:trHeight/>
           <w:jc w:val="center"/>
         </w:trPr>
         <w:tc>
@@ -6746,7 +6746,7 @@
       </w:tblGrid>
       <w:tr>
         <w:trPr>
-          <w:trHeight w:hRule="exact" w:val="2232"/>
+          <w:trHeight/>
           <w:jc w:val="center"/>
         </w:trPr>
         <w:tc>
@@ -6983,7 +6983,7 @@
       </w:tblGrid>
       <w:tr>
         <w:trPr>
-          <w:trHeight w:hRule="exact" w:val="2232"/>
+          <w:trHeight/>
           <w:jc w:val="center"/>
         </w:trPr>
         <w:tc>
@@ -7214,7 +7214,7 @@
       </w:tblGrid>
       <w:tr>
         <w:trPr>
-          <w:trHeight w:hRule="exact" w:val="2232"/>
+          <w:trHeight/>
           <w:jc w:val="center"/>
         </w:trPr>
         <w:tc>
@@ -7423,7 +7423,7 @@
       </w:tblGrid>
       <w:tr>
         <w:trPr>
-          <w:trHeight w:hRule="exact" w:val="2232"/>
+          <w:trHeight/>
           <w:jc w:val="center"/>
         </w:trPr>
         <w:tc>
@@ -7687,7 +7687,7 @@
       </w:tblGrid>
       <w:tr>
         <w:trPr>
-          <w:trHeight w:hRule="exact" w:val="2232"/>
+          <w:trHeight/>
           <w:jc w:val="center"/>
         </w:trPr>
         <w:tc>
@@ -7910,7 +7910,7 @@
       </w:tblGrid>
       <w:tr>
         <w:trPr>
-          <w:trHeight w:hRule="exact" w:val="2232"/>
+          <w:trHeight/>
           <w:jc w:val="center"/>
         </w:trPr>
         <w:tc>
@@ -8134,7 +8134,7 @@
       </w:tblGrid>
       <w:tr>
         <w:trPr>
-          <w:trHeight w:hRule="exact" w:val="2232"/>
+          <w:trHeight/>
           <w:jc w:val="center"/>
         </w:trPr>
         <w:tc>
@@ -8357,7 +8357,7 @@
       </w:tblGrid>
       <w:tr>
         <w:trPr>
-          <w:trHeight w:hRule="exact" w:val="2232"/>
+          <w:trHeight/>
           <w:jc w:val="center"/>
         </w:trPr>
         <w:tc>
@@ -8581,7 +8581,7 @@
       </w:tblGrid>
       <w:tr>
         <w:trPr>
-          <w:trHeight w:hRule="exact" w:val="2232"/>
+          <w:trHeight/>
           <w:jc w:val="center"/>
         </w:trPr>
         <w:tc>
@@ -8832,7 +8832,7 @@
       </w:tblGrid>
       <w:tr>
         <w:trPr>
-          <w:trHeight w:hRule="exact" w:val="2232"/>
+          <w:trHeight/>
           <w:jc w:val="center"/>
         </w:trPr>
         <w:tc>
@@ -9070,7 +9070,7 @@
       </w:tblGrid>
       <w:tr>
         <w:trPr>
-          <w:trHeight w:hRule="exact" w:val="2232"/>
+          <w:trHeight/>
           <w:jc w:val="center"/>
         </w:trPr>
         <w:tc>
@@ -9293,7 +9293,7 @@
       </w:tblGrid>
       <w:tr>
         <w:trPr>
-          <w:trHeight w:hRule="exact" w:val="2232"/>
+          <w:trHeight/>
           <w:jc w:val="center"/>
         </w:trPr>
         <w:tc>
@@ -9517,7 +9517,7 @@
       </w:tblGrid>
       <w:tr>
         <w:trPr>
-          <w:trHeight w:hRule="exact" w:val="2232"/>
+          <w:trHeight/>
           <w:jc w:val="center"/>
         </w:trPr>
         <w:tc>
@@ -9795,7 +9795,7 @@
       </w:tblGrid>
       <w:tr>
         <w:trPr>
-          <w:trHeight w:hRule="exact" w:val="2232"/>
+          <w:trHeight/>
           <w:jc w:val="center"/>
         </w:trPr>
         <w:tc>
@@ -10032,7 +10032,7 @@
       </w:tblGrid>
       <w:tr>
         <w:trPr>
-          <w:trHeight w:hRule="exact" w:val="2232"/>
+          <w:trHeight/>
           <w:jc w:val="center"/>
         </w:trPr>
         <w:tc>
@@ -10255,7 +10255,7 @@
       </w:tblGrid>
       <w:tr>
         <w:trPr>
-          <w:trHeight w:hRule="exact" w:val="2232"/>
+          <w:trHeight/>
           <w:jc w:val="center"/>
         </w:trPr>
         <w:tc>
@@ -10492,7 +10492,7 @@
       </w:tblGrid>
       <w:tr>
         <w:trPr>
-          <w:trHeight w:hRule="exact" w:val="2232"/>
+          <w:trHeight/>
           <w:jc w:val="center"/>
         </w:trPr>
         <w:tc>
@@ -10715,7 +10715,7 @@
       </w:tblGrid>
       <w:tr>
         <w:trPr>
-          <w:trHeight w:hRule="exact" w:val="2232"/>
+          <w:trHeight/>
           <w:jc w:val="center"/>
         </w:trPr>
         <w:tc>
@@ -10952,7 +10952,7 @@
       </w:tblGrid>
       <w:tr>
         <w:trPr>
-          <w:trHeight w:hRule="exact" w:val="2232"/>
+          <w:trHeight/>
           <w:jc w:val="center"/>
         </w:trPr>
         <w:tc>
@@ -11189,7 +11189,7 @@
       </w:tblGrid>
       <w:tr>
         <w:trPr>
-          <w:trHeight w:hRule="exact" w:val="2232"/>
+          <w:trHeight/>
           <w:jc w:val="center"/>
         </w:trPr>
         <w:tc>
@@ -11398,7 +11398,7 @@
       </w:tblGrid>
       <w:tr>
         <w:trPr>
-          <w:trHeight w:hRule="exact" w:val="2232"/>
+          <w:trHeight/>
           <w:jc w:val="center"/>
         </w:trPr>
         <w:tc>
@@ -11621,7 +11621,7 @@
       </w:tblGrid>
       <w:tr>
         <w:trPr>
-          <w:trHeight w:hRule="exact" w:val="2232"/>
+          <w:trHeight/>
           <w:jc w:val="center"/>
         </w:trPr>
         <w:tc>
@@ -11844,7 +11844,7 @@
       </w:tblGrid>
       <w:tr>
         <w:trPr>
-          <w:trHeight w:hRule="exact" w:val="2232"/>
+          <w:trHeight/>
           <w:jc w:val="center"/>
         </w:trPr>
         <w:tc>
@@ -13437,7 +13437,7 @@
       </w:tblGrid>
       <w:tr>
         <w:trPr>
-          <w:trHeight w:hRule="exact" w:val="2592"/>
+          <w:trHeight/>
           <w:jc w:val="center"/>
         </w:trPr>
         <w:tc>

</xml_diff>